<commit_message>
docs: update report and diagrams after the fixes
</commit_message>
<xml_diff>
--- a/docs/report/Tatkal_Booking_System_Design_Report.docx
+++ b/docs/report/Tatkal_Booking_System_Design_Report.docx
@@ -2340,13 +2340,13 @@
         <w:pStyle w:val="BodyText"/>
       </w:pPr>
       <w:r>
-        <w:t xml:space="preserve">A seat hold goes HELD -&gt; CONFIRMED -&gt; RELEASED (or HELD -&gt; RELEASED), and a payment PENDING -&gt; CAPTURED -&gt;</w:t>
-      </w:r>
-      <w:r>
-        <w:t xml:space="preserve"> </w:t>
-      </w:r>
-      <w:r>
-        <w:t xml:space="preserve">REFUNDED (or PENDING -&gt; DECLINED / FAILED / VOIDED); both diagrams are in</w:t>
+        <w:t xml:space="preserve">A seat hold goes HELD -&gt; CONFIRMED -&gt; RELEASED (or HELD -&gt; RELEASED, also after a 10-minute expiry), and a</w:t>
+      </w:r>
+      <w:r>
+        <w:t xml:space="preserve"> </w:t>
+      </w:r>
+      <w:r>
+        <w:t xml:space="preserve">payment PENDING -&gt; CAPTURED -&gt; REFUNDED (or PENDING -&gt; DECLINED / FAILED / VOIDED); both diagrams are in</w:t>
       </w:r>
       <w:r>
         <w:t xml:space="preserve"> </w:t>
@@ -2400,7 +2400,7 @@
       <w:r>
         <w:drawing>
           <wp:inline>
-            <wp:extent cx="5259324" cy="4380533"/>
+            <wp:extent cx="4633214" cy="3841312"/>
             <wp:effectExtent b="0" l="0" r="0" t="0"/>
             <wp:docPr descr="booking_db: bookings and passengers, the saga log, the outbox and the stored idempotency keys." title="" id="37" name="Picture"/>
             <a:graphic>
@@ -2421,7 +2421,7 @@
                   <pic:spPr bwMode="auto">
                     <a:xfrm>
                       <a:off x="0" y="0"/>
-                      <a:ext cx="5259324" cy="4380533"/>
+                      <a:ext cx="4633214" cy="3841312"/>
                     </a:xfrm>
                     <a:prstGeom prst="rect">
                       <a:avLst/>
@@ -2510,7 +2510,7 @@
       <w:r>
         <w:drawing>
           <wp:inline>
-            <wp:extent cx="3631438" cy="2200169"/>
+            <wp:extent cx="3631438" cy="2306704"/>
             <wp:effectExtent b="0" l="0" r="0" t="0"/>
             <wp:docPr descr="payment_db" title="" id="43" name="Picture"/>
             <a:graphic>
@@ -2531,7 +2531,7 @@
                   <pic:spPr bwMode="auto">
                     <a:xfrm>
                       <a:off x="0" y="0"/>
-                      <a:ext cx="3631438" cy="2200169"/>
+                      <a:ext cx="3631438" cy="2306704"/>
                     </a:xfrm>
                     <a:prstGeom prst="rect">
                       <a:avLst/>
@@ -2555,7 +2555,7 @@
       <w:r>
         <w:drawing>
           <wp:inline>
-            <wp:extent cx="2379218" cy="1647150"/>
+            <wp:extent cx="2379218" cy="1961462"/>
             <wp:effectExtent b="0" l="0" r="0" t="0"/>
             <wp:docPr descr="notification_db" title="" id="46" name="Picture"/>
             <a:graphic>
@@ -2576,7 +2576,7 @@
                   <pic:spPr bwMode="auto">
                     <a:xfrm>
                       <a:off x="0" y="0"/>
-                      <a:ext cx="2379218" cy="1647150"/>
+                      <a:ext cx="2379218" cy="1961462"/>
                     </a:xfrm>
                     <a:prstGeom prst="rect">
                       <a:avLst/>
@@ -3854,6 +3854,55 @@
             </w:pPr>
             <w:r>
               <w:t xml:space="preserve">200, 409, 503</w:t>
+            </w:r>
+          </w:p>
+        </w:tc>
+      </w:tr>
+      <w:tr>
+        <w:tc>
+          <w:tcPr/>
+          <w:p>
+            <w:pPr>
+              <w:pStyle w:val="Compact"/>
+            </w:pPr>
+            <w:r>
+              <w:t xml:space="preserve">payment</w:t>
+            </w:r>
+          </w:p>
+        </w:tc>
+        <w:tc>
+          <w:tcPr/>
+          <w:p>
+            <w:pPr>
+              <w:pStyle w:val="Compact"/>
+            </w:pPr>
+            <w:r>
+              <w:rPr>
+                <w:rStyle w:val="VerbatimChar"/>
+              </w:rPr>
+              <w:t xml:space="preserve">POST /api/v1/payments/void</w:t>
+            </w:r>
+          </w:p>
+        </w:tc>
+        <w:tc>
+          <w:tcPr/>
+          <w:p>
+            <w:pPr>
+              <w:pStyle w:val="Compact"/>
+            </w:pPr>
+            <w:r>
+              <w:t xml:space="preserve">compensation when no payment exists yet</w:t>
+            </w:r>
+          </w:p>
+        </w:tc>
+        <w:tc>
+          <w:tcPr/>
+          <w:p>
+            <w:pPr>
+              <w:pStyle w:val="Compact"/>
+            </w:pPr>
+            <w:r>
+              <w:t xml:space="preserve">200</w:t>
             </w:r>
           </w:p>
         </w:tc>
@@ -5384,7 +5433,7 @@
         <w:t xml:space="preserve"> </w:t>
       </w:r>
       <w:r>
-        <w:t xml:space="preserve">with no payment - all checks pass. The same race is an integration test (20 threads, real PostgreSQL).</w:t>
+        <w:t xml:space="preserve">with no payment - all checks pass.</w:t>
       </w:r>
     </w:p>
     <w:p>
@@ -5652,7 +5701,19 @@
         </w:numPr>
       </w:pPr>
       <w:r>
-        <w:t xml:space="preserve">If the owner dies, its lease expires and the next request takes over. Keys are purged after 24 hours.</w:t>
+        <w:t xml:space="preserve">If the owner dies, its lease expires and the next request takes over, reusing any booking already</w:t>
+      </w:r>
+      <w:r>
+        <w:t xml:space="preserve"> </w:t>
+      </w:r>
+      <w:r>
+        <w:t xml:space="preserve">made with the key (UNIQUE on bookings), so a takeover never starts a second saga. An owner token stops</w:t>
+      </w:r>
+      <w:r>
+        <w:t xml:space="preserve"> </w:t>
+      </w:r>
+      <w:r>
+        <w:t xml:space="preserve">the old owner overwriting the result. Keys are purged after 24 hours.</w:t>
       </w:r>
     </w:p>
     <w:p>
@@ -5823,25 +5884,7 @@
         <w:t xml:space="preserve"> </w:t>
       </w:r>
       <w:r>
-        <w:t xml:space="preserve">and one capture at the bank: one original response and nine replays, all byte-identical. The booking-service</w:t>
-      </w:r>
-      <w:r>
-        <w:t xml:space="preserve"> </w:t>
-      </w:r>
-      <w:r>
-        <w:t xml:space="preserve">log shows nine</w:t>
-      </w:r>
-      <w:r>
-        <w:t xml:space="preserve"> </w:t>
-      </w:r>
-      <w:r>
-        <w:t xml:space="preserve">“same idempotency key is being processed, waiting”</w:t>
-      </w:r>
-      <w:r>
-        <w:t xml:space="preserve"> </w:t>
-      </w:r>
-      <w:r>
-        <w:t xml:space="preserve">lines within one millisecond.</w:t>
+        <w:t xml:space="preserve">and one capture at the bank: one original response and nine replays, all byte-identical.</w:t>
       </w:r>
     </w:p>
     <w:p>
@@ -5865,7 +5908,13 @@
         <w:t xml:space="preserve"> </w:t>
       </w:r>
       <w:r>
-        <w:t xml:space="preserve">rather than per user (no authentication). A replay after 24 hours is treated as a new request.</w:t>
+        <w:t xml:space="preserve">rather than per user (no authentication). After 24 hours a repeat is answered from the booking itself,</w:t>
+      </w:r>
+      <w:r>
+        <w:t xml:space="preserve"> </w:t>
+      </w:r>
+      <w:r>
+        <w:t xml:space="preserve">not from the stored bytes.</w:t>
       </w:r>
     </w:p>
     <w:bookmarkEnd w:id="61"/>
@@ -6398,7 +6447,7 @@
         <w:t xml:space="preserve"> </w:t>
       </w:r>
       <w:r>
-        <w:t xml:space="preserve">when the bank recovers, the recovery job completes the refund with no API call, 23 s later. A final check</w:t>
+        <w:t xml:space="preserve">when the bank recovers, the recovery job completes the refund with no API call, 21 s later. A final check</w:t>
       </w:r>
       <w:r>
         <w:t xml:space="preserve"> </w:t>
@@ -6452,6 +6501,66 @@
           <w:b/>
           <w:bCs/>
         </w:rPr>
+        <w:t xml:space="preserve">Overlaps.</w:t>
+      </w:r>
+      <w:r>
+        <w:t xml:space="preserve"> </w:t>
+      </w:r>
+      <w:r>
+        <w:t xml:space="preserve">If booking gives up on a charge that is still running, its refund gets 503</w:t>
+      </w:r>
+      <w:r>
+        <w:t xml:space="preserve"> </w:t>
+      </w:r>
+      <w:r>
+        <w:rPr>
+          <w:rStyle w:val="VerbatimChar"/>
+        </w:rPr>
+        <w:t xml:space="preserve">PAYMENT_IN_PROGRESS</w:t>
+      </w:r>
+      <w:r>
+        <w:t xml:space="preserve"> </w:t>
+      </w:r>
+      <w:r>
+        <w:t xml:space="preserve">until the charge settles; if no payment exists yet, booking voids it</w:t>
+      </w:r>
+      <w:r>
+        <w:t xml:space="preserve"> </w:t>
+      </w:r>
+      <w:r>
+        <w:t xml:space="preserve">(</w:t>
+      </w:r>
+      <w:r>
+        <w:rPr>
+          <w:rStyle w:val="VerbatimChar"/>
+        </w:rPr>
+        <w:t xml:space="preserve">POST /payments/void</w:t>
+      </w:r>
+      <w:r>
+        <w:t xml:space="preserve">) so the late charge is refused. A charge stops retrying once its payment is closed,</w:t>
+      </w:r>
+      <w:r>
+        <w:t xml:space="preserve"> </w:t>
+      </w:r>
+      <w:r>
+        <w:t xml:space="preserve">and a capture that lands on a voided payment is refunded at once. Holds still HELD after 10 minutes are</w:t>
+      </w:r>
+      <w:r>
+        <w:t xml:space="preserve"> </w:t>
+      </w:r>
+      <w:r>
+        <w:t xml:space="preserve">released as a last safety net.</w:t>
+      </w:r>
+    </w:p>
+    <w:p>
+      <w:pPr>
+        <w:pStyle w:val="BodyText"/>
+      </w:pPr>
+      <w:r>
+        <w:rPr>
+          <w:b/>
+          <w:bCs/>
+        </w:rPr>
         <w:t xml:space="preserve">Limitations.</w:t>
       </w:r>
       <w:r>
@@ -6470,25 +6579,13 @@
         <w:t xml:space="preserve"> </w:t>
       </w:r>
       <w:r>
-        <w:t xml:space="preserve">real sagas well below that. Holds do not expire on a timer (Challenge 3B was not chosen); a charge that reaches</w:t>
-      </w:r>
-      <w:r>
-        <w:t xml:space="preserve"> </w:t>
-      </w:r>
-      <w:r>
-        <w:t xml:space="preserve">the bank after we reconciled it as</w:t>
-      </w:r>
-      <w:r>
-        <w:t xml:space="preserve"> </w:t>
-      </w:r>
-      <w:r>
-        <w:t xml:space="preserve">“never charged”</w:t>
-      </w:r>
-      <w:r>
-        <w:t xml:space="preserve"> </w:t>
-      </w:r>
-      <w:r>
-        <w:t xml:space="preserve">would need a manual refund (it is logged as an error).</w:t>
+        <w:t xml:space="preserve">real sagas well below that. We trust the bank’s lookup by key to include requests still in flight, as</w:t>
+      </w:r>
+      <w:r>
+        <w:t xml:space="preserve"> </w:t>
+      </w:r>
+      <w:r>
+        <w:t xml:space="preserve">the mock bank does; with a real bank the settlement report would be the final check.</w:t>
       </w:r>
     </w:p>
     <w:bookmarkEnd w:id="62"/>
@@ -6518,7 +6615,7 @@
         <w:t xml:space="preserve"> </w:t>
       </w:r>
       <w:r>
-        <w:t xml:space="preserve">jitter (0-200 ms, then 0-400 ms), always with the same gateway key. Outcomes are classified carefully. A</w:t>
+        <w:t xml:space="preserve">jitter (0-200 ms, then 0-400 ms), always with the same gateway key. A</w:t>
       </w:r>
       <w:r>
         <w:t xml:space="preserve"> </w:t>
@@ -6536,7 +6633,7 @@
         <w:t xml:space="preserve"> </w:t>
       </w:r>
       <w:r>
-        <w:t xml:space="preserve">PENDING payment is reconciled with the bank before any refund.</w:t>
+        <w:t xml:space="preserve">PENDING payment is reconciled with the bank before any refund, once its charge can no longer be running.</w:t>
       </w:r>
     </w:p>
     <w:p>
@@ -6643,13 +6740,13 @@
         <w:t xml:space="preserve"> </w:t>
       </w:r>
       <w:r>
-        <w:t xml:space="preserve">Bookings succeed on the second or third attempt, each captured</w:t>
-      </w:r>
-      <w:r>
-        <w:t xml:space="preserve"> </w:t>
-      </w:r>
-      <w:r>
-        <w:t xml:space="preserve">once.</w:t>
+        <w:t xml:space="preserve">Three of four bookings succeeded (one on a retry) and one failed</w:t>
+      </w:r>
+      <w:r>
+        <w:t xml:space="preserve"> </w:t>
+      </w:r>
+      <w:r>
+        <w:t xml:space="preserve">cleanly after three attempts with its seats released; none was captured twice.</w:t>
       </w:r>
     </w:p>
     <w:bookmarkEnd w:id="63"/>
@@ -6706,7 +6803,7 @@
         <w:t xml:space="preserve"> </w:t>
       </w:r>
       <w:r>
-        <w:t xml:space="preserve">(91) test every rule BR1-BR7 as plain functions, plus the fingerprint, backoff, retry</w:t>
+        <w:t xml:space="preserve">(94) test every rule BR1-BR7 as plain functions, plus the fingerprint, backoff, retry</w:t>
       </w:r>
       <w:r>
         <w:t xml:space="preserve"> </w:t>
@@ -6746,31 +6843,31 @@
         <w:t xml:space="preserve"> </w:t>
       </w:r>
       <w:r>
-        <w:t xml:space="preserve">(11) run against the service’s real PostgreSQL, in a throwaway schema per run:</w:t>
-      </w:r>
-      <w:r>
-        <w:t xml:space="preserve"> </w:t>
-      </w:r>
-      <w:r>
-        <w:t xml:space="preserve">20 threads racing for 5 seats (and the naive version overselling), 10 parallel same-key payments,</w:t>
-      </w:r>
-      <w:r>
-        <w:t xml:space="preserve"> </w:t>
-      </w:r>
-      <w:r>
-        <w:t xml:space="preserve">5 parallel payments for one booking with different keys, duplicate notification events, and the saga</w:t>
-      </w:r>
-      <w:r>
-        <w:t xml:space="preserve"> </w:t>
-      </w:r>
-      <w:r>
-        <w:t xml:space="preserve">with fake inventory and payment services - the step-3 failure order, a failed compensation finished by</w:t>
-      </w:r>
-      <w:r>
-        <w:t xml:space="preserve"> </w:t>
-      </w:r>
-      <w:r>
-        <w:t xml:space="preserve">recovery, an abandoned saga, and an unknown hold.</w:t>
+        <w:t xml:space="preserve">(30) run against the service’s real PostgreSQL, in a throwaway schema per run:</w:t>
+      </w:r>
+      <w:r>
+        <w:t xml:space="preserve"> </w:t>
+      </w:r>
+      <w:r>
+        <w:t xml:space="preserve">20 threads racing for 5 seats (and the naive version overselling), parallel same-key and same-booking</w:t>
+      </w:r>
+      <w:r>
+        <w:t xml:space="preserve"> </w:t>
+      </w:r>
+      <w:r>
+        <w:t xml:space="preserve">payments, a hold retry overlapping the first attempt, hold expiry, refunds and voids racing a charge,</w:t>
+      </w:r>
+      <w:r>
+        <w:t xml:space="preserve"> </w:t>
+      </w:r>
+      <w:r>
+        <w:t xml:space="preserve">key takeover, duplicate and partly failed notifications, and the saga with fake inventory and payment</w:t>
+      </w:r>
+      <w:r>
+        <w:t xml:space="preserve"> </w:t>
+      </w:r>
+      <w:r>
+        <w:t xml:space="preserve">services (step-3 failure order, failed compensation finished by recovery, abandoned saga, unknown hold).</w:t>
       </w:r>
     </w:p>
     <w:p>
@@ -6878,7 +6975,7 @@
         <w:t xml:space="preserve"> </w:t>
       </w:r>
       <w:r>
-        <w:t xml:space="preserve">All 110 service tests and 7 end-to-end tests pass (</w:t>
+        <w:t xml:space="preserve">All 132 service tests and 7 end-to-end tests pass (</w:t>
       </w:r>
       <w:r>
         <w:rPr>
@@ -6987,7 +7084,7 @@
               <w:pStyle w:val="Compact"/>
             </w:pPr>
             <w:r>
-              <w:t xml:space="preserve">2</w:t>
+              <w:t xml:space="preserve">4</w:t>
             </w:r>
           </w:p>
         </w:tc>
@@ -7022,18 +7119,18 @@
               <w:pStyle w:val="Compact"/>
             </w:pPr>
             <w:r>
-              <w:t xml:space="preserve">28</w:t>
-            </w:r>
-          </w:p>
-        </w:tc>
-        <w:tc>
-          <w:tcPr/>
-          <w:p>
-            <w:pPr>
-              <w:pStyle w:val="Compact"/>
-            </w:pPr>
-            <w:r>
-              <w:t xml:space="preserve">2</w:t>
+              <w:t xml:space="preserve">31</w:t>
+            </w:r>
+          </w:p>
+        </w:tc>
+        <w:tc>
+          <w:tcPr/>
+          <w:p>
+            <w:pPr>
+              <w:pStyle w:val="Compact"/>
+            </w:pPr>
+            <w:r>
+              <w:t xml:space="preserve">10</w:t>
             </w:r>
           </w:p>
         </w:tc>
@@ -7079,7 +7176,7 @@
               <w:pStyle w:val="Compact"/>
             </w:pPr>
             <w:r>
-              <w:t xml:space="preserve">2</w:t>
+              <w:t xml:space="preserve">5</w:t>
             </w:r>
           </w:p>
         </w:tc>
@@ -7125,7 +7222,7 @@
               <w:pStyle w:val="Compact"/>
             </w:pPr>
             <w:r>
-              <w:t xml:space="preserve">5</w:t>
+              <w:t xml:space="preserve">11</w:t>
             </w:r>
           </w:p>
         </w:tc>
@@ -7797,7 +7894,13 @@
         <w:t xml:space="preserve"> </w:t>
       </w:r>
       <w:r>
-        <w:t xml:space="preserve">retries), holds do not expire on a timer (3B), and notifications could move to a broker (3D).</w:t>
+        <w:t xml:space="preserve">retries), holds expire only through a coarse 10-minute sweep rather than a real reservation timer (3B),</w:t>
+      </w:r>
+      <w:r>
+        <w:t xml:space="preserve"> </w:t>
+      </w:r>
+      <w:r>
+        <w:t xml:space="preserve">and notifications could move to a broker (3D).</w:t>
       </w:r>
     </w:p>
     <w:p>
@@ -7881,7 +7984,7 @@
         <w:br/>
       </w:r>
       <w:r>
-        <w:t xml:space="preserve">Google Drive (demo video, report, documents): [add link before submission] - Demo video: [add link before submission]</w:t>
+        <w:t xml:space="preserve">Google Drive (video, report, documents): [add link before submission] - Demo video: [add link]</w:t>
       </w:r>
     </w:p>
     <w:p>
@@ -8420,7 +8523,154 @@
         <w:t xml:space="preserve"> </w:t>
       </w:r>
       <w:r>
-        <w:t xml:space="preserve">needs a unique constraint</w:t>
+        <w:t xml:space="preserve">needs more than a unique constraint: a review found that a retry overlapping the first hold request got</w:t>
+      </w:r>
+      <w:r>
+        <w:t xml:space="preserve"> </w:t>
+      </w:r>
+      <w:r>
+        <w:t xml:space="preserve">409 and left that hold’s seats owned by nobody. Inserting the hold row before taking the seats fixed it,</w:t>
+      </w:r>
+      <w:r>
+        <w:t xml:space="preserve"> </w:t>
+      </w:r>
+      <w:r>
+        <w:t xml:space="preserve">and we added a 10-minute expiry for holds as a safety net. With more time I would split the hot quota row</w:t>
+      </w:r>
+      <w:r>
+        <w:t xml:space="preserve"> </w:t>
+      </w:r>
+      <w:r>
+        <w:t xml:space="preserve">into buckets.</w:t>
+      </w:r>
+    </w:p>
+    <w:p>
+      <w:pPr>
+        <w:pStyle w:val="BodyText"/>
+      </w:pPr>
+      <w:r>
+        <w:rPr>
+          <w:b/>
+          <w:bCs/>
+        </w:rPr>
+        <w:t xml:space="preserve">Atharva Kadam (payment-service and mock-bank-gateway).</w:t>
+      </w:r>
+      <w:r>
+        <w:t xml:space="preserve"> </w:t>
+      </w:r>
+      <w:r>
+        <w:t xml:space="preserve">I built the payment service, its client for</w:t>
+      </w:r>
+      <w:r>
+        <w:t xml:space="preserve"> </w:t>
+      </w:r>
+      <w:r>
+        <w:t xml:space="preserve">the bank and the mock bank itself. The hardest problem was the difference between</w:t>
+      </w:r>
+      <w:r>
+        <w:t xml:space="preserve"> </w:t>
+      </w:r>
+      <w:r>
+        <w:t xml:space="preserve">“the bank said no”</w:t>
+      </w:r>
+      <w:r>
+        <w:t xml:space="preserve"> </w:t>
+      </w:r>
+      <w:r>
+        <w:t xml:space="preserve">and</w:t>
+      </w:r>
+      <w:r>
+        <w:t xml:space="preserve"> </w:t>
+      </w:r>
+      <w:r>
+        <w:t xml:space="preserve">“the bank did not answer”</w:t>
+      </w:r>
+      <w:r>
+        <w:t xml:space="preserve">. A declined payment is final, a refused connection means nothing happened, but</w:t>
+      </w:r>
+      <w:r>
+        <w:t xml:space="preserve"> </w:t>
+      </w:r>
+      <w:r>
+        <w:t xml:space="preserve">a timeout after the request was sent is unknown. I handled it by keeping such payments PENDING,</w:t>
+      </w:r>
+      <w:r>
+        <w:t xml:space="preserve"> </w:t>
+      </w:r>
+      <w:r>
+        <w:t xml:space="preserve">retrying only with the same idempotency key, and reconciling with the bank before any refund. Making the</w:t>
+      </w:r>
+      <w:r>
+        <w:t xml:space="preserve"> </w:t>
+      </w:r>
+      <w:r>
+        <w:t xml:space="preserve">mock bank deduplicate requests while the first one is still being processed is what lets the slow-bank</w:t>
+      </w:r>
+      <w:r>
+        <w:t xml:space="preserve"> </w:t>
+      </w:r>
+      <w:r>
+        <w:t xml:space="preserve">run end with exactly one capture over two attempts. A review also found a gap I had missed: a refund</w:t>
+      </w:r>
+      <w:r>
+        <w:t xml:space="preserve"> </w:t>
+      </w:r>
+      <w:r>
+        <w:t xml:space="preserve">arriving while my charge was still retrying voided the payment, and a capture that came back afterwards</w:t>
+      </w:r>
+      <w:r>
+        <w:t xml:space="preserve"> </w:t>
+      </w:r>
+      <w:r>
+        <w:t xml:space="preserve">was kept. Closing it took a</w:t>
+      </w:r>
+      <w:r>
+        <w:t xml:space="preserve"> </w:t>
+      </w:r>
+      <w:r>
+        <w:t xml:space="preserve">“still wanted?”</w:t>
+      </w:r>
+      <w:r>
+        <w:t xml:space="preserve"> </w:t>
+      </w:r>
+      <w:r>
+        <w:t xml:space="preserve">check before every attempt, a 503 while a charge may still be</w:t>
+      </w:r>
+      <w:r>
+        <w:t xml:space="preserve"> </w:t>
+      </w:r>
+      <w:r>
+        <w:t xml:space="preserve">running, and an immediate refund for a capture that lands on a voided payment. Next I would add a circuit</w:t>
+      </w:r>
+      <w:r>
+        <w:t xml:space="preserve"> </w:t>
+      </w:r>
+      <w:r>
+        <w:t xml:space="preserve">breaker so a dead bank fails fast instead of costing three attempts per request.</w:t>
+      </w:r>
+    </w:p>
+    <w:p>
+      <w:pPr>
+        <w:pStyle w:val="BodyText"/>
+      </w:pPr>
+      <w:r>
+        <w:rPr>
+          <w:b/>
+          <w:bCs/>
+        </w:rPr>
+        <w:t xml:space="preserve">N Abhishek Reddy (notification-service and end-to-end tests).</w:t>
+      </w:r>
+      <w:r>
+        <w:t xml:space="preserve"> </w:t>
+      </w:r>
+      <w:r>
+        <w:t xml:space="preserve">I owned notifications and the</w:t>
+      </w:r>
+      <w:r>
+        <w:t xml:space="preserve"> </w:t>
+      </w:r>
+      <w:r>
+        <w:t xml:space="preserve">end-to-end and saga test scripts. The interesting part of notifications was that the outbox delivers</w:t>
       </w:r>
       <w:r>
         <w:t xml:space="preserve"> </w:t>
@@ -8430,226 +8680,93 @@
           <w:i/>
           <w:iCs/>
         </w:rPr>
-        <w:t xml:space="preserve">and</w:t>
-      </w:r>
-      <w:r>
-        <w:t xml:space="preserve"> </w:t>
-      </w:r>
-      <w:r>
-        <w:t xml:space="preserve">handling for the race where two inserts collide. With more time I would</w:t>
-      </w:r>
-      <w:r>
-        <w:t xml:space="preserve"> </w:t>
-      </w:r>
-      <w:r>
-        <w:t xml:space="preserve">split the hot quota row into buckets and add hold expiry, so a stuck saga could never keep seats for long.</w:t>
-      </w:r>
-    </w:p>
-    <w:p>
-      <w:pPr>
-        <w:pStyle w:val="BodyText"/>
-      </w:pPr>
-      <w:r>
-        <w:rPr>
-          <w:b/>
-          <w:bCs/>
-        </w:rPr>
-        <w:t xml:space="preserve">Atharva Kadam (payment-service and mock-bank-gateway).</w:t>
-      </w:r>
-      <w:r>
-        <w:t xml:space="preserve"> </w:t>
-      </w:r>
-      <w:r>
-        <w:t xml:space="preserve">I built the payment service, its client for</w:t>
-      </w:r>
-      <w:r>
-        <w:t xml:space="preserve"> </w:t>
-      </w:r>
-      <w:r>
-        <w:t xml:space="preserve">the bank and the mock bank itself. The hardest problem was the difference between</w:t>
-      </w:r>
-      <w:r>
-        <w:t xml:space="preserve"> </w:t>
-      </w:r>
-      <w:r>
-        <w:t xml:space="preserve">“the bank said no”</w:t>
-      </w:r>
-      <w:r>
-        <w:t xml:space="preserve"> </w:t>
-      </w:r>
-      <w:r>
-        <w:t xml:space="preserve">and</w:t>
-      </w:r>
-      <w:r>
-        <w:t xml:space="preserve"> </w:t>
-      </w:r>
-      <w:r>
-        <w:t xml:space="preserve">“the bank did not answer”</w:t>
-      </w:r>
-      <w:r>
-        <w:t xml:space="preserve">. A declined payment is final, a refused connection means nothing happened, but</w:t>
-      </w:r>
-      <w:r>
-        <w:t xml:space="preserve"> </w:t>
-      </w:r>
-      <w:r>
-        <w:t xml:space="preserve">a timeout after the request was sent is unknown. I handled it by keeping such payments PENDING,</w:t>
-      </w:r>
-      <w:r>
-        <w:t xml:space="preserve"> </w:t>
-      </w:r>
-      <w:r>
-        <w:t xml:space="preserve">retrying only with the same idempotency key, and reconciling with the bank before any refund. Making the</w:t>
-      </w:r>
-      <w:r>
-        <w:t xml:space="preserve"> </w:t>
-      </w:r>
-      <w:r>
-        <w:t xml:space="preserve">mock bank deduplicate requests while the first one is still being processed is what lets the slow-bank</w:t>
-      </w:r>
-      <w:r>
-        <w:t xml:space="preserve"> </w:t>
-      </w:r>
-      <w:r>
-        <w:t xml:space="preserve">run end with exactly one capture over two attempts. A small bug taught me something too: the bank’s reset</w:t>
-      </w:r>
-      <w:r>
-        <w:t xml:space="preserve"> </w:t>
-      </w:r>
-      <w:r>
-        <w:t xml:space="preserve">endpoint returned a body with a 204 status, which broke the HTTP connection for the next request on the</w:t>
-      </w:r>
-      <w:r>
-        <w:t xml:space="preserve"> </w:t>
-      </w:r>
-      <w:r>
-        <w:t xml:space="preserve">same keep-alive socket. I would change two things: add a circuit breaker so a dead bank fails fast instead</w:t>
-      </w:r>
-      <w:r>
-        <w:t xml:space="preserve"> </w:t>
-      </w:r>
-      <w:r>
-        <w:t xml:space="preserve">of costing three attempts per request, and give the mock bank a</w:t>
-      </w:r>
-      <w:r>
-        <w:t xml:space="preserve"> </w:t>
-      </w:r>
-      <w:r>
-        <w:t xml:space="preserve">“void order”</w:t>
-      </w:r>
-      <w:r>
-        <w:t xml:space="preserve"> </w:t>
-      </w:r>
-      <w:r>
-        <w:t xml:space="preserve">call to close the</w:t>
-      </w:r>
-      <w:r>
-        <w:t xml:space="preserve"> </w:t>
-      </w:r>
-      <w:r>
-        <w:t xml:space="preserve">late-capture gap described in section 6.3.</w:t>
-      </w:r>
-    </w:p>
-    <w:p>
-      <w:pPr>
-        <w:pStyle w:val="BodyText"/>
-      </w:pPr>
-      <w:r>
-        <w:rPr>
-          <w:b/>
-          <w:bCs/>
-        </w:rPr>
-        <w:t xml:space="preserve">N Abhishek Reddy (notification-service and end-to-end tests).</w:t>
-      </w:r>
-      <w:r>
-        <w:t xml:space="preserve"> </w:t>
-      </w:r>
-      <w:r>
-        <w:t xml:space="preserve">I owned notifications and the</w:t>
-      </w:r>
-      <w:r>
-        <w:t xml:space="preserve"> </w:t>
-      </w:r>
-      <w:r>
-        <w:t xml:space="preserve">end-to-end and saga test scripts. The interesting part of notifications was that the outbox delivers</w:t>
-      </w:r>
-      <w:r>
-        <w:t xml:space="preserve"> </w:t>
+        <w:t xml:space="preserve">at</w:t>
       </w:r>
       <w:r>
         <w:rPr>
           <w:i/>
           <w:iCs/>
         </w:rPr>
-        <w:t xml:space="preserve">at</w:t>
+        <w:t xml:space="preserve"> </w:t>
       </w:r>
       <w:r>
         <w:rPr>
           <w:i/>
           <w:iCs/>
         </w:rPr>
-        <w:t xml:space="preserve"> </w:t>
-      </w:r>
-      <w:r>
-        <w:rPr>
-          <w:i/>
-          <w:iCs/>
-        </w:rPr>
         <w:t xml:space="preserve">least</w:t>
       </w:r>
       <w:r>
         <w:t xml:space="preserve"> </w:t>
       </w:r>
       <w:r>
-        <w:t xml:space="preserve">once, so my service had to be an idempotent consumer: it claims each event with a unique row</w:t>
-      </w:r>
-      <w:r>
-        <w:t xml:space="preserve"> </w:t>
-      </w:r>
-      <w:r>
-        <w:t xml:space="preserve">before sending and gives the claim back if the SMS provider fails, so a retry can send it. The hardest</w:t>
-      </w:r>
-      <w:r>
-        <w:t xml:space="preserve"> </w:t>
-      </w:r>
-      <w:r>
-        <w:t xml:space="preserve">problem on the testing side was making failure scenarios deterministic. Our first attempt at</w:t>
-      </w:r>
-      <w:r>
-        <w:t xml:space="preserve"> </w:t>
-      </w:r>
-      <w:r>
-        <w:t xml:space="preserve">“the</w:t>
-      </w:r>
-      <w:r>
-        <w:t xml:space="preserve"> </w:t>
-      </w:r>
-      <w:r>
-        <w:t xml:space="preserve">refund fails”</w:t>
-      </w:r>
-      <w:r>
-        <w:t xml:space="preserve"> </w:t>
-      </w:r>
-      <w:r>
-        <w:t xml:space="preserve">depended on timing; adding a partial-outage mode to the mock bank (refunds down, charges</w:t>
-      </w:r>
-      <w:r>
-        <w:t xml:space="preserve"> </w:t>
-      </w:r>
-      <w:r>
-        <w:t xml:space="preserve">up) made it repeatable. I also found that our integration tests were writing into the same tables as the</w:t>
-      </w:r>
-      <w:r>
-        <w:t xml:space="preserve"> </w:t>
-      </w:r>
-      <w:r>
-        <w:t xml:space="preserve">running service, so we moved them into a throwaway schema. Next time I would add a dead-letter view for</w:t>
-      </w:r>
-      <w:r>
-        <w:t xml:space="preserve"> </w:t>
-      </w:r>
-      <w:r>
-        <w:t xml:space="preserve">events that can never be delivered, and run the e2e suite in CI on every push.</w:t>
+        <w:t xml:space="preserve">once, so my service had to be an idempotent consumer: it claims each channel of an event with a</w:t>
+      </w:r>
+      <w:r>
+        <w:t xml:space="preserve"> </w:t>
+      </w:r>
+      <w:r>
+        <w:t xml:space="preserve">unique row, marks it SENT as soon as it goes out, and on a provider failure gives back only what was not</w:t>
+      </w:r>
+      <w:r>
+        <w:t xml:space="preserve"> </w:t>
+      </w:r>
+      <w:r>
+        <w:t xml:space="preserve">sent. My first version released the whole event when only the e-mail failed, so the retry sent the SMS</w:t>
+      </w:r>
+      <w:r>
+        <w:t xml:space="preserve"> </w:t>
+      </w:r>
+      <w:r>
+        <w:t xml:space="preserve">twice, and it answered</w:t>
+      </w:r>
+      <w:r>
+        <w:t xml:space="preserve"> </w:t>
+      </w:r>
+      <w:r>
+        <w:t xml:space="preserve">“duplicate”</w:t>
+      </w:r>
+      <w:r>
+        <w:t xml:space="preserve"> </w:t>
+      </w:r>
+      <w:r>
+        <w:t xml:space="preserve">while another delivery was still sending. The hardest problem on the</w:t>
+      </w:r>
+      <w:r>
+        <w:t xml:space="preserve"> </w:t>
+      </w:r>
+      <w:r>
+        <w:t xml:space="preserve">testing side was making failure scenarios deterministic. Our first attempt at</w:t>
+      </w:r>
+      <w:r>
+        <w:t xml:space="preserve"> </w:t>
+      </w:r>
+      <w:r>
+        <w:t xml:space="preserve">“the refund fails”</w:t>
+      </w:r>
+      <w:r>
+        <w:t xml:space="preserve"> </w:t>
+      </w:r>
+      <w:r>
+        <w:t xml:space="preserve">depended</w:t>
+      </w:r>
+      <w:r>
+        <w:t xml:space="preserve"> </w:t>
+      </w:r>
+      <w:r>
+        <w:t xml:space="preserve">on timing; adding a partial-outage mode to the mock bank (refunds down, charges up) made it repeatable.</w:t>
+      </w:r>
+      <w:r>
+        <w:t xml:space="preserve"> </w:t>
+      </w:r>
+      <w:r>
+        <w:t xml:space="preserve">Next time I would add a dead-letter view for events that can never be delivered, and run the e2e suite in</w:t>
+      </w:r>
+      <w:r>
+        <w:t xml:space="preserve"> </w:t>
+      </w:r>
+      <w:r>
+        <w:t xml:space="preserve">CI on every push.</w:t>
       </w:r>
     </w:p>
     <w:bookmarkEnd w:id="70"/>
@@ -8761,7 +8878,7 @@
           <w:b/>
           <w:bCs/>
         </w:rPr>
-        <w:t xml:space="preserve">Running and evidence.</w:t>
+        <w:t xml:space="preserve">Running, evidence and review.</w:t>
       </w:r>
       <w:r>
         <w:t xml:space="preserve"> </w:t>
@@ -8779,7 +8896,16 @@
         <w:t xml:space="preserve">evidence/</w:t>
       </w:r>
       <w:r>
-        <w:t xml:space="preserve">. The outputs in that folder are unedited.</w:t>
+        <w:t xml:space="preserve"> </w:t>
+      </w:r>
+      <w:r>
+        <w:t xml:space="preserve">(the outputs are unedited). A separate Copilot review agent then reviewed the code; the six</w:t>
+      </w:r>
+      <w:r>
+        <w:t xml:space="preserve"> </w:t>
+      </w:r>
+      <w:r>
+        <w:t xml:space="preserve">problems it found (mostly retries, compensations and late results racing each other) were fixed and retested.</w:t>
       </w:r>
     </w:p>
     <w:p>
@@ -8971,6 +9097,18 @@
               <w:t xml:space="preserve">tests/integration/test_br1_concurrent_holds.py</w:t>
             </w:r>
             <w:r>
+              <w:t xml:space="preserve">,</w:t>
+            </w:r>
+            <w:r>
+              <w:t xml:space="preserve"> </w:t>
+            </w:r>
+            <w:r>
+              <w:rPr>
+                <w:rStyle w:val="VerbatimChar"/>
+              </w:rPr>
+              <w:t xml:space="preserve">test_hold_retry_and_expiry.py</w:t>
+            </w:r>
+            <w:r>
               <w:t xml:space="preserve">, challenge 1</w:t>
             </w:r>
           </w:p>
@@ -9013,16 +9151,7 @@
               <w:t xml:space="preserve">validate_passengers</w:t>
             </w:r>
             <w:r>
-              <w:t xml:space="preserve">), called in</w:t>
-            </w:r>
-            <w:r>
-              <w:t xml:space="preserve"> </w:t>
-            </w:r>
-            <w:r>
-              <w:rPr>
-                <w:rStyle w:val="VerbatimChar"/>
-              </w:rPr>
-              <w:t xml:space="preserve">api/routes.py</w:t>
+              <w:t xml:space="preserve">)</w:t>
             </w:r>
           </w:p>
         </w:tc>
@@ -9188,6 +9317,18 @@
                 <w:rStyle w:val="VerbatimChar"/>
               </w:rPr>
               <w:t xml:space="preserve">tests/integration/test_idempotent_payments_db.py</w:t>
+            </w:r>
+            <w:r>
+              <w:t xml:space="preserve">,</w:t>
+            </w:r>
+            <w:r>
+              <w:t xml:space="preserve"> </w:t>
+            </w:r>
+            <w:r>
+              <w:rPr>
+                <w:rStyle w:val="VerbatimChar"/>
+              </w:rPr>
+              <w:t xml:space="preserve">test_payment_fencing_db.py</w:t>
             </w:r>
             <w:r>
               <w:t xml:space="preserve">, challenge 2</w:t>

</xml_diff>

<commit_message>
report: BITS ids, reflections, wording; re-export openapi
</commit_message>
<xml_diff>
--- a/docs/report/Tatkal_Booking_System_Design_Report.docx
+++ b/docs/report/Tatkal_Booking_System_Design_Report.docx
@@ -99,7 +99,7 @@
               <w:pStyle w:val="Compact"/>
             </w:pPr>
             <w:r>
-              <w:t xml:space="preserve">[BITS ID]</w:t>
+              <w:t xml:space="preserve">2025TM93139</w:t>
             </w:r>
           </w:p>
         </w:tc>
@@ -134,7 +134,7 @@
               <w:pStyle w:val="Compact"/>
             </w:pPr>
             <w:r>
-              <w:t xml:space="preserve">[BITS ID]</w:t>
+              <w:t xml:space="preserve">2025TM93530</w:t>
             </w:r>
           </w:p>
         </w:tc>
@@ -169,7 +169,7 @@
               <w:pStyle w:val="Compact"/>
             </w:pPr>
             <w:r>
-              <w:t xml:space="preserve">[BITS ID]</w:t>
+              <w:t xml:space="preserve">2025TM93221</w:t>
             </w:r>
           </w:p>
         </w:tc>
@@ -204,7 +204,7 @@
               <w:pStyle w:val="Compact"/>
             </w:pPr>
             <w:r>
-              <w:t xml:space="preserve">[BITS ID]</w:t>
+              <w:t xml:space="preserve">2023MT93400</w:t>
             </w:r>
           </w:p>
         </w:tc>
@@ -243,7 +243,7 @@
         <w:br/>
       </w:r>
       <w:r>
-        <w:t xml:space="preserve">Demo video and documents: [Google Drive link - see section 10]</w:t>
+        <w:t xml:space="preserve">Demo video and documents: [Google Drive link]</w:t>
       </w:r>
     </w:p>
     <w:bookmarkStart w:id="14" w:name="problem-and-scope"/>
@@ -269,7 +269,7 @@
         <w:pStyle w:val="FirstParagraph"/>
       </w:pPr>
       <w:r>
-        <w:t xml:space="preserve">Every Indian Railways train sets aside a small</w:t>
+        <w:t xml:space="preserve">Every Indian Railways train keeps a small</w:t>
       </w:r>
       <w:r>
         <w:t xml:space="preserve"> </w:t>
@@ -291,19 +291,19 @@
         <w:t xml:space="preserve"> </w:t>
       </w:r>
       <w:r>
-        <w:t xml:space="preserve">journey (10:00 for AC classes, 11:00 for the rest). Far more people want those seats than there are</w:t>
-      </w:r>
-      <w:r>
-        <w:t xml:space="preserve"> </w:t>
-      </w:r>
-      <w:r>
-        <w:t xml:space="preserve">seats, so the first minutes after opening look like a stress test: thousands of attempts at once,</w:t>
-      </w:r>
-      <w:r>
-        <w:t xml:space="preserve"> </w:t>
-      </w:r>
-      <w:r>
-        <w:t xml:space="preserve">sold-out pages that still showed seats a moment earlier, passengers retrying</w:t>
+        <w:t xml:space="preserve">journey (10:00 for AC classes, 11:00 for the rest). Many more people want these seats than there are</w:t>
+      </w:r>
+      <w:r>
+        <w:t xml:space="preserve"> </w:t>
+      </w:r>
+      <w:r>
+        <w:t xml:space="preserve">seats. Anyone who has tried knows the first few minutes: thousands of attempts at the same time, seats</w:t>
+      </w:r>
+      <w:r>
+        <w:t xml:space="preserve"> </w:t>
+      </w:r>
+      <w:r>
+        <w:t xml:space="preserve">shown as free that are gone a second later, people pressing</w:t>
       </w:r>
       <w:r>
         <w:t xml:space="preserve"> </w:t>
@@ -315,19 +315,19 @@
         <w:t xml:space="preserve"> </w:t>
       </w:r>
       <w:r>
-        <w:t xml:space="preserve">when the bank page</w:t>
-      </w:r>
-      <w:r>
-        <w:t xml:space="preserve"> </w:t>
-      </w:r>
-      <w:r>
-        <w:t xml:space="preserve">hangs, and the familiar</w:t>
-      </w:r>
-      <w:r>
-        <w:t xml:space="preserve"> </w:t>
-      </w:r>
-      <w:r>
-        <w:t xml:space="preserve">“amount debited but ticket not booked - refund in 5-7 days”</w:t>
+        <w:t xml:space="preserve">again because the bank page is stuck,</w:t>
+      </w:r>
+      <w:r>
+        <w:t xml:space="preserve"> </w:t>
+      </w:r>
+      <w:r>
+        <w:t xml:space="preserve">and the usual</w:t>
+      </w:r>
+      <w:r>
+        <w:t xml:space="preserve"> </w:t>
+      </w:r>
+      <w:r>
+        <w:t xml:space="preserve">“amount debited but ticket not booked, refund in 5-7 days”</w:t>
       </w:r>
       <w:r>
         <w:t xml:space="preserve">.</w:t>
@@ -338,25 +338,25 @@
         <w:pStyle w:val="BodyText"/>
       </w:pPr>
       <w:r>
-        <w:t xml:space="preserve">We built the back end of such a booking system. A passenger asks for 1-4 seats on a train, date and</w:t>
-      </w:r>
-      <w:r>
-        <w:t xml:space="preserve"> </w:t>
-      </w:r>
-      <w:r>
-        <w:t xml:space="preserve">class. The system holds the seats, takes the payment through a bank, confirms the seats, issues a PNR</w:t>
-      </w:r>
-      <w:r>
-        <w:t xml:space="preserve"> </w:t>
-      </w:r>
-      <w:r>
-        <w:t xml:space="preserve">and sends an SMS and e-mail. The interesting part is not the happy path but what happens when requests</w:t>
-      </w:r>
-      <w:r>
-        <w:t xml:space="preserve"> </w:t>
-      </w:r>
-      <w:r>
-        <w:t xml:space="preserve">arrive together, arrive twice, or a step fails half way - which is what the assignment asks us to show.</w:t>
+        <w:t xml:space="preserve">We built the back end for this. A passenger asks for 1-4 seats on a train, date and class. The system</w:t>
+      </w:r>
+      <w:r>
+        <w:t xml:space="preserve"> </w:t>
+      </w:r>
+      <w:r>
+        <w:t xml:space="preserve">holds the seats, takes the payment through a bank, confirms the seats, gives a PNR and sends an SMS and</w:t>
+      </w:r>
+      <w:r>
+        <w:t xml:space="preserve"> </w:t>
+      </w:r>
+      <w:r>
+        <w:t xml:space="preserve">e-mail. Most of our effort went into the cases around that flow: requests that arrive together, requests</w:t>
+      </w:r>
+      <w:r>
+        <w:t xml:space="preserve"> </w:t>
+      </w:r>
+      <w:r>
+        <w:t xml:space="preserve">that arrive twice, and steps that fail half way.</w:t>
       </w:r>
     </w:p>
     <w:p>
@@ -364,7 +364,7 @@
         <w:pStyle w:val="BodyText"/>
       </w:pPr>
       <w:r>
-        <w:t xml:space="preserve">The five required conditions map onto the domain naturally:</w:t>
+        <w:t xml:space="preserve">The five conditions from the brief map onto the domain like this:</w:t>
       </w:r>
     </w:p>
     <w:tbl>
@@ -520,7 +520,7 @@
               <w:t xml:space="preserve"> </w:t>
             </w:r>
             <w:r>
-              <w:t xml:space="preserve">- they take seats and money</w:t>
+              <w:t xml:space="preserve">(they take seats and money)</w:t>
             </w:r>
           </w:p>
         </w:tc>
@@ -738,7 +738,7 @@
               <w:pStyle w:val="Compact"/>
             </w:pPr>
             <w:r>
-              <w:t xml:space="preserve">The seats of a train/date/class are never over-allocated. A request that does not fully fit is refused - no partial allocation.</w:t>
+              <w:t xml:space="preserve">The seats of a train/date/class are never over-allocated. A request that does not fully fit is refused (no partial allocation).</w:t>
             </w:r>
           </w:p>
         </w:tc>
@@ -843,7 +843,7 @@
               <w:pStyle w:val="Compact"/>
             </w:pPr>
             <w:r>
-              <w:t xml:space="preserve">A booking is charged at most once. Only a captured payment can be refunded, in full and only once.</w:t>
+              <w:t xml:space="preserve">A booking is charged at most once. Only money that was really taken can be refunded, in full and only once.</w:t>
             </w:r>
           </w:p>
         </w:tc>
@@ -970,7 +970,7 @@
         <w:pStyle w:val="BodyText"/>
       </w:pPr>
       <w:r>
-        <w:t xml:space="preserve">Each rule is written once, as a plain function in the owning service’s</w:t>
+        <w:t xml:space="preserve">Each rule is a plain function in the owning service’s</w:t>
       </w:r>
       <w:r>
         <w:t xml:space="preserve"> </w:t>
@@ -985,13 +985,7 @@
         <w:t xml:space="preserve"> </w:t>
       </w:r>
       <w:r>
-        <w:t xml:space="preserve">package, and has unit</w:t>
-      </w:r>
-      <w:r>
-        <w:t xml:space="preserve"> </w:t>
-      </w:r>
-      <w:r>
-        <w:t xml:space="preserve">tests; the full rule-to-code-to-test map is</w:t>
+        <w:t xml:space="preserve">package and has unit tests.</w:t>
       </w:r>
       <w:r>
         <w:t xml:space="preserve"> </w:t>
@@ -1006,7 +1000,7 @@
         <w:t xml:space="preserve"> </w:t>
       </w:r>
       <w:r>
-        <w:t xml:space="preserve">(summarised in Appendix D).</w:t>
+        <w:t xml:space="preserve">maps every rule to its code and tests (summary in Appendix D).</w:t>
       </w:r>
     </w:p>
     <w:bookmarkEnd w:id="12"/>
@@ -1389,7 +1383,7 @@
         <w:pStyle w:val="FirstParagraph"/>
       </w:pPr>
       <w:r>
-        <w:t xml:space="preserve">We decomposed by</w:t>
+        <w:t xml:space="preserve">We split by</w:t>
       </w:r>
       <w:r>
         <w:t xml:space="preserve"> </w:t>
@@ -1405,31 +1399,31 @@
         <w:t xml:space="preserve"> </w:t>
       </w:r>
       <w:r>
-        <w:t xml:space="preserve">(CS05): selling seats, taking money, looking after a</w:t>
-      </w:r>
-      <w:r>
-        <w:t xml:space="preserve"> </w:t>
-      </w:r>
-      <w:r>
-        <w:t xml:space="preserve">passenger’s booking, and talking to the passenger are things a railway does separately and staffs</w:t>
-      </w:r>
-      <w:r>
-        <w:t xml:space="preserve"> </w:t>
-      </w:r>
-      <w:r>
-        <w:t xml:space="preserve">separately. The common closure principle points the same way - each service changes for its own reason:</w:t>
-      </w:r>
-      <w:r>
-        <w:t xml:space="preserve"> </w:t>
-      </w:r>
-      <w:r>
-        <w:t xml:space="preserve">a fare revision or a new class touches only inventory; a new bank or refund policy only payment; a new</w:t>
-      </w:r>
-      <w:r>
-        <w:t xml:space="preserve"> </w:t>
-      </w:r>
-      <w:r>
-        <w:t xml:space="preserve">passenger rule only booking; a new SMS template or provider only notification.</w:t>
+        <w:t xml:space="preserve">(CS05). Selling seats, taking money, managing a passenger’s booking</w:t>
+      </w:r>
+      <w:r>
+        <w:t xml:space="preserve"> </w:t>
+      </w:r>
+      <w:r>
+        <w:t xml:space="preserve">and messaging the passenger are separate jobs in a railway, done by different teams. The common closure</w:t>
+      </w:r>
+      <w:r>
+        <w:t xml:space="preserve"> </w:t>
+      </w:r>
+      <w:r>
+        <w:t xml:space="preserve">principle gives the same answer, since each service changes for its own reasons: a fare revision or a new</w:t>
+      </w:r>
+      <w:r>
+        <w:t xml:space="preserve"> </w:t>
+      </w:r>
+      <w:r>
+        <w:t xml:space="preserve">class only touches inventory, a new bank or refund policy only payment, a new passenger rule only booking,</w:t>
+      </w:r>
+      <w:r>
+        <w:t xml:space="preserve"> </w:t>
+      </w:r>
+      <w:r>
+        <w:t xml:space="preserve">and a new SMS template or provider only notification.</w:t>
       </w:r>
     </w:p>
     <w:p>
@@ -1437,25 +1431,19 @@
         <w:pStyle w:val="BodyText"/>
       </w:pPr>
       <w:r>
-        <w:t xml:space="preserve">The split also follows the data. The seat counter has exactly one writer (inventory) and money has</w:t>
-      </w:r>
-      <w:r>
-        <w:t xml:space="preserve"> </w:t>
-      </w:r>
-      <w:r>
-        <w:t xml:space="preserve">exactly one writer (payment), so the two invariants we care most about - no overselling (BR1) and no</w:t>
-      </w:r>
-      <w:r>
-        <w:t xml:space="preserve"> </w:t>
-      </w:r>
-      <w:r>
-        <w:t xml:space="preserve">double charge (BR4) - can each be enforced inside one local database transaction instead of across</w:t>
-      </w:r>
-      <w:r>
-        <w:t xml:space="preserve"> </w:t>
-      </w:r>
-      <w:r>
-        <w:t xml:space="preserve">services. Booking does not own seats or money; it owns the</w:t>
+        <w:t xml:space="preserve">The split also follows the data. Only inventory writes the seat counter and only payment writes money,</w:t>
+      </w:r>
+      <w:r>
+        <w:t xml:space="preserve"> </w:t>
+      </w:r>
+      <w:r>
+        <w:t xml:space="preserve">so the two rules we care about most, no overselling (BR1) and no double charge (BR4), can each be</w:t>
+      </w:r>
+      <w:r>
+        <w:t xml:space="preserve"> </w:t>
+      </w:r>
+      <w:r>
+        <w:t xml:space="preserve">enforced in one local database transaction. Booking owns neither seats nor money. It owns the</w:t>
       </w:r>
       <w:r>
         <w:t xml:space="preserve"> </w:t>
@@ -1471,13 +1459,7 @@
         <w:t xml:space="preserve"> </w:t>
       </w:r>
       <w:r>
-        <w:t xml:space="preserve">of a booking, which is why it</w:t>
-      </w:r>
-      <w:r>
-        <w:t xml:space="preserve"> </w:t>
-      </w:r>
-      <w:r>
-        <w:t xml:space="preserve">coordinates the other two.</w:t>
+        <w:t xml:space="preserve">of a booking, and that is why it coordinates the other two.</w:t>
       </w:r>
     </w:p>
     <w:p>
@@ -1485,19 +1467,19 @@
         <w:pStyle w:val="BodyText"/>
       </w:pPr>
       <w:r>
-        <w:t xml:space="preserve">Finally the services behave differently under load, which matters for Assignment 2: inventory is the hot</w:t>
-      </w:r>
-      <w:r>
-        <w:t xml:space="preserve"> </w:t>
-      </w:r>
-      <w:r>
-        <w:t xml:space="preserve">spot during a Tatkal rush, payment spends most of its time waiting for a slow bank, and notification can</w:t>
-      </w:r>
-      <w:r>
-        <w:t xml:space="preserve"> </w:t>
-      </w:r>
-      <w:r>
-        <w:t xml:space="preserve">fall behind for minutes without anyone being harmed.</w:t>
+        <w:t xml:space="preserve">The services also behave differently under load, which will matter in Assignment 2. Inventory is the hot</w:t>
+      </w:r>
+      <w:r>
+        <w:t xml:space="preserve"> </w:t>
+      </w:r>
+      <w:r>
+        <w:t xml:space="preserve">spot during a rush, payment mostly waits for a slow bank, and notification can fall a few minutes behind</w:t>
+      </w:r>
+      <w:r>
+        <w:t xml:space="preserve"> </w:t>
+      </w:r>
+      <w:r>
+        <w:t xml:space="preserve">without hurting anyone.</w:t>
       </w:r>
     </w:p>
     <w:bookmarkEnd w:id="16"/>
@@ -1541,7 +1523,7 @@
         <w:t xml:space="preserve"> </w:t>
       </w:r>
       <w:r>
-        <w:t xml:space="preserve">hold into a two-service call - the</w:t>
+        <w:t xml:space="preserve">hold into a two-service call, which is the</w:t>
       </w:r>
       <w:r>
         <w:t xml:space="preserve"> </w:t>
@@ -1553,13 +1535,13 @@
         <w:t xml:space="preserve"> </w:t>
       </w:r>
       <w:r>
-        <w:t xml:space="preserve">smell the brief</w:t>
-      </w:r>
-      <w:r>
-        <w:t xml:space="preserve"> </w:t>
-      </w:r>
-      <w:r>
-        <w:t xml:space="preserve">warns about.</w:t>
+        <w:t xml:space="preserve">problem</w:t>
+      </w:r>
+      <w:r>
+        <w:t xml:space="preserve"> </w:t>
+      </w:r>
+      <w:r>
+        <w:t xml:space="preserve">the brief warns about.</w:t>
       </w:r>
     </w:p>
     <w:p>
@@ -1683,7 +1665,7 @@
         <w:t xml:space="preserve"> </w:t>
       </w:r>
       <w:r>
-        <w:t xml:space="preserve">service’s API - a god service. The orchestration belongs next to the booking state it changes.</w:t>
+        <w:t xml:space="preserve">service’s API (a god service). The orchestration belongs next to the booking state it changes.</w:t>
       </w:r>
     </w:p>
     <w:p>
@@ -1711,13 +1693,7 @@
         <w:t xml:space="preserve"> </w:t>
       </w:r>
       <w:r>
-        <w:t xml:space="preserve">add a component without adding behaviour in Assignment 1. It becomes a Kubernetes Ingress in</w:t>
-      </w:r>
-      <w:r>
-        <w:t xml:space="preserve"> </w:t>
-      </w:r>
-      <w:r>
-        <w:t xml:space="preserve">Assignment 2.</w:t>
+        <w:t xml:space="preserve">only add a component in Assignment 1. In Assignment 2 a Kubernetes Ingress can play that role.</w:t>
       </w:r>
     </w:p>
     <w:bookmarkEnd w:id="17"/>
@@ -1866,25 +1842,25 @@
         <w:t xml:space="preserve"> </w:t>
       </w:r>
       <w:r>
-        <w:t xml:space="preserve">because the passenger is waiting for a yes or no, and we need the</w:t>
-      </w:r>
-      <w:r>
-        <w:t xml:space="preserve"> </w:t>
-      </w:r>
-      <w:r>
-        <w:t xml:space="preserve">price from step 1 before step 2. The longest chain is client -&gt; booking -&gt; payment -&gt; bank, three hops,</w:t>
-      </w:r>
-      <w:r>
-        <w:t xml:space="preserve"> </w:t>
-      </w:r>
-      <w:r>
-        <w:t xml:space="preserve">and the bank is behind payment on purpose so its slowness is handled in one place. Inventory and payment</w:t>
-      </w:r>
-      <w:r>
-        <w:t xml:space="preserve"> </w:t>
-      </w:r>
-      <w:r>
-        <w:t xml:space="preserve">are called one after the other by booking (a fan-out, not a chain). Notifications are</w:t>
+        <w:t xml:space="preserve">because the passenger is waiting for a yes or no, and step 2</w:t>
+      </w:r>
+      <w:r>
+        <w:t xml:space="preserve"> </w:t>
+      </w:r>
+      <w:r>
+        <w:t xml:space="preserve">needs the price from step 1. The longest chain is client -&gt; booking -&gt; payment -&gt; bank (three hops). We</w:t>
+      </w:r>
+      <w:r>
+        <w:t xml:space="preserve"> </w:t>
+      </w:r>
+      <w:r>
+        <w:t xml:space="preserve">put the bank behind payment so that its slowness is handled in one place. Booking calls inventory and</w:t>
+      </w:r>
+      <w:r>
+        <w:t xml:space="preserve"> </w:t>
+      </w:r>
+      <w:r>
+        <w:t xml:space="preserve">payment one after the other, so that part is a fan-out rather than a chain. Notifications are</w:t>
       </w:r>
       <w:r>
         <w:t xml:space="preserve"> </w:t>
@@ -1897,19 +1873,13 @@
         <w:t xml:space="preserve">asynchronous</w:t>
       </w:r>
       <w:r>
-        <w:t xml:space="preserve">:</w:t>
-      </w:r>
-      <w:r>
-        <w:t xml:space="preserve"> </w:t>
-      </w:r>
-      <w:r>
-        <w:t xml:space="preserve">booking writes an event into an outbox table in the same transaction as the status change, and a</w:t>
-      </w:r>
-      <w:r>
-        <w:t xml:space="preserve"> </w:t>
-      </w:r>
-      <w:r>
-        <w:t xml:space="preserve">background dispatcher delivers it.</w:t>
+        <w:t xml:space="preserve">: booking writes an event into an outbox table in the same transaction as the status</w:t>
+      </w:r>
+      <w:r>
+        <w:t xml:space="preserve"> </w:t>
+      </w:r>
+      <w:r>
+        <w:t xml:space="preserve">change, and a background dispatcher delivers it.</w:t>
       </w:r>
     </w:p>
     <w:p>
@@ -1917,7 +1887,7 @@
         <w:pStyle w:val="BodyText"/>
       </w:pPr>
       <w:r>
-        <w:t xml:space="preserve">Cross-cutting concerns are the same in every service:</w:t>
+        <w:t xml:space="preserve">Every service handles the cross-cutting parts the same way:</w:t>
       </w:r>
     </w:p>
     <w:p>
@@ -2006,7 +1976,7 @@
         <w:t xml:space="preserve"> </w:t>
       </w:r>
       <w:r>
-        <w:t xml:space="preserve">outbox stores it with the event, so even the asynchronous SMS logs under the original request’s id.</w:t>
+        <w:t xml:space="preserve">outbox stores it with the event, so the SMS sent later still logs under the original request’s id.</w:t>
       </w:r>
     </w:p>
     <w:p>
@@ -2210,13 +2180,13 @@
         <w:t xml:space="preserve"> </w:t>
       </w:r>
       <w:r>
-        <w:t xml:space="preserve">case, and here it ends correctly within the same request:</w:t>
-      </w:r>
-      <w:r>
-        <w:t xml:space="preserve"> </w:t>
-      </w:r>
-      <w:r>
-        <w:t xml:space="preserve">the passenger gets</w:t>
+        <w:t xml:space="preserve">case. In our system it is sorted out inside the same</w:t>
+      </w:r>
+      <w:r>
+        <w:t xml:space="preserve"> </w:t>
+      </w:r>
+      <w:r>
+        <w:t xml:space="preserve">request: the passenger gets</w:t>
       </w:r>
       <w:r>
         <w:t xml:space="preserve"> </w:t>
@@ -2255,19 +2225,19 @@
         <w:t xml:space="preserve">REFUNDED</w:t>
       </w:r>
       <w:r>
-        <w:t xml:space="preserve">, the seats are back in the quota, and a refund SMS follows. Other failure paths use the same</w:t>
-      </w:r>
-      <w:r>
-        <w:t xml:space="preserve"> </w:t>
-      </w:r>
-      <w:r>
-        <w:t xml:space="preserve">mechanism with a shorter plan: sold out at step 1 (nothing to undo, 409), bank declines at step 2 (release</w:t>
-      </w:r>
-      <w:r>
-        <w:t xml:space="preserve"> </w:t>
-      </w:r>
-      <w:r>
-        <w:t xml:space="preserve">only, 402), bank unreachable (release only, 503), bank silent (refund-if-taken plus release, 504).</w:t>
+        <w:t xml:space="preserve">, the seats are back in the quota and a refund SMS follows. The other failure paths use the</w:t>
+      </w:r>
+      <w:r>
+        <w:t xml:space="preserve"> </w:t>
+      </w:r>
+      <w:r>
+        <w:t xml:space="preserve">same mechanism with a shorter plan: sold out at step 1 (nothing to undo, 409), bank declines at step 2</w:t>
+      </w:r>
+      <w:r>
+        <w:t xml:space="preserve"> </w:t>
+      </w:r>
+      <w:r>
+        <w:t xml:space="preserve">(release only, 402), bank unreachable (release only, 503), bank silent (refund if taken, then release, 504).</w:t>
       </w:r>
     </w:p>
     <w:bookmarkEnd w:id="30"/>
@@ -2358,19 +2328,13 @@
         <w:t xml:space="preserve">docs/diagrams/</w:t>
       </w:r>
       <w:r>
-        <w:t xml:space="preserve">. The hold is</w:t>
-      </w:r>
-      <w:r>
-        <w:t xml:space="preserve"> </w:t>
-      </w:r>
-      <w:r>
-        <w:t xml:space="preserve">what makes the saga safe for other passengers: while a booking is between steps 1 and 3 its seats are</w:t>
-      </w:r>
-      <w:r>
-        <w:t xml:space="preserve"> </w:t>
-      </w:r>
-      <w:r>
-        <w:t xml:space="preserve">HELD, so nobody else can sell them (a semantic lock).</w:t>
+        <w:t xml:space="preserve">. The hold protects other passengers while a saga is running: between steps 1 and 3 the</w:t>
+      </w:r>
+      <w:r>
+        <w:t xml:space="preserve"> </w:t>
+      </w:r>
+      <w:r>
+        <w:t xml:space="preserve">seats are HELD, so nobody else can sell them (a semantic lock).</w:t>
       </w:r>
     </w:p>
     <w:bookmarkEnd w:id="34"/>
@@ -2995,19 +2959,19 @@
         <w:pStyle w:val="FirstParagraph"/>
       </w:pPr>
       <w:r>
-        <w:t xml:space="preserve">There are no foreign keys or joins across services: a service keeps only the ids of other services’</w:t>
-      </w:r>
-      <w:r>
-        <w:t xml:space="preserve"> </w:t>
-      </w:r>
-      <w:r>
-        <w:t xml:space="preserve">entities and asks the owner when it needs more. Integrity across services is kept by the saga rather</w:t>
-      </w:r>
-      <w:r>
-        <w:t xml:space="preserve"> </w:t>
-      </w:r>
-      <w:r>
-        <w:t xml:space="preserve">than by the database, helped by uniqueness on the referencing side -</w:t>
+        <w:t xml:space="preserve">There are no foreign keys or joins across services. A service keeps only the ids of other services’</w:t>
+      </w:r>
+      <w:r>
+        <w:t xml:space="preserve"> </w:t>
+      </w:r>
+      <w:r>
+        <w:t xml:space="preserve">entities and asks the owner when it needs more. Integrity across services comes from the saga, helped by</w:t>
+      </w:r>
+      <w:r>
+        <w:t xml:space="preserve"> </w:t>
+      </w:r>
+      <w:r>
+        <w:t xml:space="preserve">uniqueness on the referencing side:</w:t>
       </w:r>
       <w:r>
         <w:t xml:space="preserve"> </w:t>
@@ -3052,19 +3016,25 @@
         <w:t xml:space="preserve"> </w:t>
       </w:r>
       <w:r>
-        <w:t xml:space="preserve">guarantees one hold and one payment per booking even if a step is retried.</w:t>
-      </w:r>
-      <w:r>
-        <w:t xml:space="preserve"> </w:t>
-      </w:r>
-      <w:r>
-        <w:t xml:space="preserve">Booking keeps two deliberate copies: the amount quoted at hold time (the price the passenger agreed to,</w:t>
-      </w:r>
-      <w:r>
-        <w:t xml:space="preserve"> </w:t>
-      </w:r>
-      <w:r>
-        <w:t xml:space="preserve">even if the fare changes later) and the refunded amount.</w:t>
+        <w:t xml:space="preserve">allows only</w:t>
+      </w:r>
+      <w:r>
+        <w:t xml:space="preserve"> </w:t>
+      </w:r>
+      <w:r>
+        <w:t xml:space="preserve">one hold and one payment per booking, even when a step is retried. Booking keeps two copies on purpose:</w:t>
+      </w:r>
+      <w:r>
+        <w:t xml:space="preserve"> </w:t>
+      </w:r>
+      <w:r>
+        <w:t xml:space="preserve">the amount quoted at hold time (the price the passenger agreed to, even if the fare changes later) and</w:t>
+      </w:r>
+      <w:r>
+        <w:t xml:space="preserve"> </w:t>
+      </w:r>
+      <w:r>
+        <w:t xml:space="preserve">the refunded amount.</w:t>
       </w:r>
     </w:p>
     <w:p>
@@ -3072,19 +3042,19 @@
         <w:pStyle w:val="BodyText"/>
       </w:pPr>
       <w:r>
-        <w:t xml:space="preserve">The four databases are physically separate containers with their own users (CS07 contrasts physical and</w:t>
-      </w:r>
-      <w:r>
-        <w:t xml:space="preserve"> </w:t>
-      </w:r>
-      <w:r>
-        <w:t xml:space="preserve">logical separation; physical costs a little more memory but makes the boundary impossible to cross by</w:t>
-      </w:r>
-      <w:r>
-        <w:t xml:space="preserve"> </w:t>
-      </w:r>
-      <w:r>
-        <w:t xml:space="preserve">accident and maps directly onto one database per pod in Assignment 2).</w:t>
+        <w:t xml:space="preserve">The four databases are separate containers with their own users. CS07 compares physical and logical</w:t>
+      </w:r>
+      <w:r>
+        <w:t xml:space="preserve"> </w:t>
+      </w:r>
+      <w:r>
+        <w:t xml:space="preserve">separation. Physical separation costs a little more memory, but nobody can cross the boundary by</w:t>
+      </w:r>
+      <w:r>
+        <w:t xml:space="preserve"> </w:t>
+      </w:r>
+      <w:r>
+        <w:t xml:space="preserve">accident and it maps directly onto one database per pod in Assignment 2.</w:t>
       </w:r>
       <w:r>
         <w:t xml:space="preserve"> </w:t>
@@ -3099,13 +3069,13 @@
         <w:t xml:space="preserve"> </w:t>
       </w:r>
       <w:r>
-        <w:t xml:space="preserve">tries every service’s credentials against every database; only the 4 diagonal combinations connect</w:t>
-      </w:r>
-      <w:r>
-        <w:t xml:space="preserve"> </w:t>
-      </w:r>
-      <w:r>
-        <w:t xml:space="preserve">(evidence:</w:t>
+        <w:t xml:space="preserve">tries every service’s credentials against every database, and only the 4 diagonal combinations connect</w:t>
+      </w:r>
+      <w:r>
+        <w:t xml:space="preserve"> </w:t>
+      </w:r>
+      <w:r>
+        <w:t xml:space="preserve">(evidence in</w:t>
       </w:r>
       <w:r>
         <w:t xml:space="preserve"> </w:t>
@@ -3117,23 +3087,13 @@
         <w:t xml:space="preserve">evidence/database-per-service/</w:t>
       </w:r>
       <w:r>
-        <w:t xml:space="preserve">). Our evidence scripts read the four databases to</w:t>
-      </w:r>
-      <w:r>
-        <w:t xml:space="preserve"> </w:t>
-      </w:r>
-      <w:r>
-        <w:rPr>
-          <w:i/>
-          <w:iCs/>
-        </w:rPr>
-        <w:t xml:space="preserve">prove</w:t>
-      </w:r>
-      <w:r>
-        <w:t xml:space="preserve"> </w:t>
-      </w:r>
-      <w:r>
-        <w:t xml:space="preserve">outcomes, but correlate them by id in Python, exactly as a reporting job would - no service does this.</w:t>
+        <w:t xml:space="preserve">). Our evidence scripts do read all four databases to check</w:t>
+      </w:r>
+      <w:r>
+        <w:t xml:space="preserve"> </w:t>
+      </w:r>
+      <w:r>
+        <w:t xml:space="preserve">outcomes, but they join the results by id in Python like a reporting job would. No service does this.</w:t>
       </w:r>
     </w:p>
     <w:bookmarkEnd w:id="50"/>
@@ -4355,7 +4315,7 @@
         <w:pStyle w:val="FirstParagraph"/>
       </w:pPr>
       <w:r>
-        <w:t xml:space="preserve">Every error from every service uses one format, RFC 9457</w:t>
+        <w:t xml:space="preserve">All services return errors in one format, RFC 9457</w:t>
       </w:r>
       <w:r>
         <w:t xml:space="preserve"> </w:t>
@@ -4380,7 +4340,13 @@
         <w:t xml:space="preserve">application/problem+json</w:t>
       </w:r>
       <w:r>
-        <w:t xml:space="preserve">), extended with a stable machine-readable</w:t>
+        <w:t xml:space="preserve">), with</w:t>
+      </w:r>
+      <w:r>
+        <w:t xml:space="preserve"> </w:t>
+      </w:r>
+      <w:r>
+        <w:t xml:space="preserve">two extra fields: a stable machine-readable</w:t>
       </w:r>
       <w:r>
         <w:t xml:space="preserve"> </w:t>
@@ -4407,7 +4373,13 @@
         <w:t xml:space="preserve">correlation_id</w:t>
       </w:r>
       <w:r>
-        <w:t xml:space="preserve">; business-rule failures add</w:t>
+        <w:t xml:space="preserve">. Business-rule</w:t>
+      </w:r>
+      <w:r>
+        <w:t xml:space="preserve"> </w:t>
+      </w:r>
+      <w:r>
+        <w:t xml:space="preserve">failures also carry</w:t>
       </w:r>
       <w:r>
         <w:t xml:space="preserve"> </w:t>
@@ -4419,7 +4391,7 @@
         <w:t xml:space="preserve">rule</w:t>
       </w:r>
       <w:r>
-        <w:t xml:space="preserve">, and validation failures list field</w:t>
+        <w:t xml:space="preserve">, and validation failures list the field</w:t>
       </w:r>
       <w:r>
         <w:t xml:space="preserve"> </w:t>
@@ -4744,13 +4716,13 @@
         <w:pStyle w:val="FirstParagraph"/>
       </w:pPr>
       <w:r>
-        <w:t xml:space="preserve">We chose a published standard over an invented envelope so that clients and tools already understand</w:t>
-      </w:r>
-      <w:r>
-        <w:t xml:space="preserve"> </w:t>
-      </w:r>
-      <w:r>
-        <w:t xml:space="preserve">it, and the</w:t>
+        <w:t xml:space="preserve">We went with a published standard instead of inventing our own envelope, since clients and tools</w:t>
+      </w:r>
+      <w:r>
+        <w:t xml:space="preserve"> </w:t>
+      </w:r>
+      <w:r>
+        <w:t xml:space="preserve">already know it. The</w:t>
       </w:r>
       <w:r>
         <w:t xml:space="preserve"> </w:t>
@@ -4765,7 +4737,7 @@
         <w:t xml:space="preserve"> </w:t>
       </w:r>
       <w:r>
-        <w:t xml:space="preserve">field gives scripts something stable to assert on. The handlers live in each</w:t>
+        <w:t xml:space="preserve">field gives scripts something stable to check. The handlers are in each</w:t>
       </w:r>
       <w:r>
         <w:t xml:space="preserve"> </w:t>
@@ -4783,7 +4755,7 @@
         <w:t xml:space="preserve">core/errors.py</w:t>
       </w:r>
       <w:r>
-        <w:t xml:space="preserve">; the OpenAPI files document every 4xx/5xx with this schema.</w:t>
+        <w:t xml:space="preserve">, and the OpenAPI files document every 4xx/5xx response with this schema.</w:t>
       </w:r>
     </w:p>
     <w:bookmarkEnd w:id="55"/>
@@ -4833,13 +4805,13 @@
         <w:t xml:space="preserve"> </w:t>
       </w:r>
       <w:r>
-        <w:t xml:space="preserve">for the last five Sleeper seats in the same instant. The</w:t>
-      </w:r>
-      <w:r>
-        <w:t xml:space="preserve"> </w:t>
-      </w:r>
-      <w:r>
-        <w:t xml:space="preserve">quota must never go below zero and exactly five must get a ticket.</w:t>
+        <w:t xml:space="preserve">for the last five Sleeper seats at the same moment. The</w:t>
+      </w:r>
+      <w:r>
+        <w:t xml:space="preserve"> </w:t>
+      </w:r>
+      <w:r>
+        <w:t xml:space="preserve">quota must never go below zero, and five of them (no more, no fewer) must get a ticket.</w:t>
       </w:r>
     </w:p>
     <w:p>
@@ -5056,13 +5028,13 @@
         <w:pStyle w:val="FirstParagraph"/>
       </w:pPr>
       <w:r>
-        <w:t xml:space="preserve">PostgreSQL row-locks the quota row for the update; a concurrent transaction waits for the lock and then</w:t>
-      </w:r>
-      <w:r>
-        <w:t xml:space="preserve"> </w:t>
-      </w:r>
-      <w:r>
-        <w:t xml:space="preserve">re-evaluates the</w:t>
+        <w:t xml:space="preserve">PostgreSQL locks the quota row for the update. A second transaction waits for the lock and then</w:t>
+      </w:r>
+      <w:r>
+        <w:t xml:space="preserve"> </w:t>
+      </w:r>
+      <w:r>
+        <w:t xml:space="preserve">re-checks the</w:t>
       </w:r>
       <w:r>
         <w:t xml:space="preserve"> </w:t>
@@ -5095,7 +5067,7 @@
         <w:t xml:space="preserve">409 SEATS_UNAVAILABLE</w:t>
       </w:r>
       <w:r>
-        <w:t xml:space="preserve">. Two constraints back it up:</w:t>
+        <w:t xml:space="preserve">. Two constraints back this up:</w:t>
       </w:r>
       <w:r>
         <w:t xml:space="preserve"> </w:t>
@@ -5107,10 +5079,7 @@
         <w:t xml:space="preserve">CHECK (available_seats &gt;= 0)</w:t>
       </w:r>
       <w:r>
-        <w:t xml:space="preserve"> </w:t>
-      </w:r>
-      <w:r>
-        <w:t xml:space="preserve">and</w:t>
+        <w:t xml:space="preserve">, and</w:t>
       </w:r>
       <w:r>
         <w:t xml:space="preserve"> </w:t>
@@ -5125,7 +5094,7 @@
         <w:t xml:space="preserve"> </w:t>
       </w:r>
       <w:r>
-        <w:t xml:space="preserve">on holds (a retried hold cannot take seats twice).</w:t>
+        <w:t xml:space="preserve">on holds so a retried hold cannot take seats twice.</w:t>
       </w:r>
     </w:p>
     <w:p>
@@ -5137,7 +5106,7 @@
           <w:b/>
           <w:bCs/>
         </w:rPr>
-        <w:t xml:space="preserve">Why plain check-then-update fails.</w:t>
+        <w:t xml:space="preserve">Why check-then-update fails.</w:t>
       </w:r>
       <w:r>
         <w:t xml:space="preserve"> </w:t>
@@ -5158,25 +5127,25 @@
         <w:t xml:space="preserve"> </w:t>
       </w:r>
       <w:r>
-        <w:t xml:space="preserve">are separate steps. Every request that reads before another writes sees the same free seat;</w:t>
-      </w:r>
-      <w:r>
-        <w:t xml:space="preserve"> </w:t>
-      </w:r>
-      <w:r>
-        <w:t xml:space="preserve">under READ COMMITTED the second write simply overwrites the first (a lost update). More holds are created</w:t>
-      </w:r>
-      <w:r>
-        <w:t xml:space="preserve"> </w:t>
-      </w:r>
-      <w:r>
-        <w:t xml:space="preserve">than seats exist, and even the CHECK constraint does not notice because the counter never goes negative.</w:t>
-      </w:r>
-      <w:r>
-        <w:t xml:space="preserve"> </w:t>
-      </w:r>
-      <w:r>
-        <w:t xml:space="preserve">We kept that naive version behind a dev-only switch (</w:t>
+        <w:t xml:space="preserve">are separate steps. Every request that reads before another one writes sees the same free seat, and under</w:t>
+      </w:r>
+      <w:r>
+        <w:t xml:space="preserve"> </w:t>
+      </w:r>
+      <w:r>
+        <w:t xml:space="preserve">READ COMMITTED the second write just overwrites the first (a lost update). We end up with more holds than</w:t>
+      </w:r>
+      <w:r>
+        <w:t xml:space="preserve"> </w:t>
+      </w:r>
+      <w:r>
+        <w:t xml:space="preserve">seats, and the CHECK constraint does not notice because the counter never goes negative. We kept this</w:t>
+      </w:r>
+      <w:r>
+        <w:t xml:space="preserve"> </w:t>
+      </w:r>
+      <w:r>
+        <w:t xml:space="preserve">naive version behind a dev-only switch (</w:t>
       </w:r>
       <w:r>
         <w:rPr>
@@ -5185,7 +5154,7 @@
         <w:t xml:space="preserve">HOLD_STRATEGY=naive</w:t>
       </w:r>
       <w:r>
-        <w:t xml:space="preserve">) to prove the point.</w:t>
+        <w:t xml:space="preserve">) so that we could show it.</w:t>
       </w:r>
     </w:p>
     <w:p>
@@ -5315,13 +5284,13 @@
         <w:t xml:space="preserve"> </w:t>
       </w:r>
       <w:r>
-        <w:t xml:space="preserve">right model if passengers choose seats; we sell counts, so a counter is simpler. SERIALIZABLE isolation</w:t>
-      </w:r>
-      <w:r>
-        <w:t xml:space="preserve"> </w:t>
-      </w:r>
-      <w:r>
-        <w:t xml:space="preserve">would work but turns the rush into serialization failures the client must retry.</w:t>
+        <w:t xml:space="preserve">right model if passengers choose seats. We sell counts, so a counter is simpler. SERIALIZABLE isolation</w:t>
+      </w:r>
+      <w:r>
+        <w:t xml:space="preserve"> </w:t>
+      </w:r>
+      <w:r>
+        <w:t xml:space="preserve">would work, but it turns the rush into serialization failures that the client has to retry.</w:t>
       </w:r>
     </w:p>
     <w:p>
@@ -5433,7 +5402,7 @@
         <w:t xml:space="preserve"> </w:t>
       </w:r>
       <w:r>
-        <w:t xml:space="preserve">with no payment - all checks pass.</w:t>
+        <w:t xml:space="preserve">with no payment. All checks pass.</w:t>
       </w:r>
     </w:p>
     <w:p>
@@ -5457,13 +5426,13 @@
         <w:t xml:space="preserve"> </w:t>
       </w:r>
       <w:r>
-        <w:t xml:space="preserve">(a few milliseconds each). That is fine for hundreds of concurrent requests; at Tatkal-day scale we would</w:t>
-      </w:r>
-      <w:r>
-        <w:t xml:space="preserve"> </w:t>
-      </w:r>
-      <w:r>
-        <w:t xml:space="preserve">add a waiting room in front, or split the quota into buckets.</w:t>
+        <w:t xml:space="preserve">(a few milliseconds each). That is fine for hundreds of concurrent requests. At real Tatkal scale we</w:t>
+      </w:r>
+      <w:r>
+        <w:t xml:space="preserve"> </w:t>
+      </w:r>
+      <w:r>
+        <w:t xml:space="preserve">would add a waiting room in front, or split the quota into buckets.</w:t>
       </w:r>
     </w:p>
     <w:bookmarkEnd w:id="60"/>
@@ -5599,13 +5568,13 @@
         <w:t xml:space="preserve">INSERT ... ON CONFLICT DO NOTHING</w:t>
       </w:r>
       <w:r>
-        <w:t xml:space="preserve">, so the primary key lets exactly one of any</w:t>
-      </w:r>
-      <w:r>
-        <w:t xml:space="preserve"> </w:t>
-      </w:r>
-      <w:r>
-        <w:t xml:space="preserve">number of simultaneous requests become the owner.</w:t>
+        <w:t xml:space="preserve">, so however many requests arrive together,</w:t>
+      </w:r>
+      <w:r>
+        <w:t xml:space="preserve"> </w:t>
+      </w:r>
+      <w:r>
+        <w:t xml:space="preserve">the primary key lets only one of them become the owner.</w:t>
       </w:r>
     </w:p>
     <w:p>
@@ -5721,7 +5690,7 @@
         <w:pStyle w:val="FirstParagraph"/>
       </w:pPr>
       <w:r>
-        <w:t xml:space="preserve">Behind this are two more layers:</w:t>
+        <w:t xml:space="preserve">There are two more layers behind this.</w:t>
       </w:r>
       <w:r>
         <w:t xml:space="preserve"> </w:t>
@@ -5736,25 +5705,25 @@
         <w:t xml:space="preserve"> </w:t>
       </w:r>
       <w:r>
-        <w:t xml:space="preserve">on payments refuses a second charge even with a</w:t>
-      </w:r>
-      <w:r>
-        <w:t xml:space="preserve"> </w:t>
-      </w:r>
-      <w:r>
-        <w:t xml:space="preserve">new key (409, BR4), and every call to the bank carries the same gateway key, so a retry after a timeout</w:t>
-      </w:r>
-      <w:r>
-        <w:t xml:space="preserve"> </w:t>
-      </w:r>
-      <w:r>
-        <w:t xml:space="preserve">is deduplicated by the bank itself. Hold, confirm, release, refund and cancel are idempotent by state</w:t>
-      </w:r>
-      <w:r>
-        <w:t xml:space="preserve"> </w:t>
-      </w:r>
-      <w:r>
-        <w:t xml:space="preserve">and need no key.</w:t>
+        <w:t xml:space="preserve">on payments refuses a second charge even</w:t>
+      </w:r>
+      <w:r>
+        <w:t xml:space="preserve"> </w:t>
+      </w:r>
+      <w:r>
+        <w:t xml:space="preserve">with a new key (409, BR4), and every call to the bank carries the same gateway key, so the bank itself</w:t>
+      </w:r>
+      <w:r>
+        <w:t xml:space="preserve"> </w:t>
+      </w:r>
+      <w:r>
+        <w:t xml:space="preserve">drops a retry after a timeout. Hold, confirm, release, refund and cancel are idempotent by state and need</w:t>
+      </w:r>
+      <w:r>
+        <w:t xml:space="preserve"> </w:t>
+      </w:r>
+      <w:r>
+        <w:t xml:space="preserve">no key.</w:t>
       </w:r>
     </w:p>
     <w:p>
@@ -5799,25 +5768,13 @@
         <w:t xml:space="preserve"> </w:t>
       </w:r>
       <w:r>
-        <w:t xml:space="preserve">a component and loses the transactional link to the booking database. Stripe-style</w:t>
-      </w:r>
-      <w:r>
-        <w:t xml:space="preserve"> </w:t>
-      </w:r>
-      <w:r>
-        <w:t xml:space="preserve">“409 while in</w:t>
-      </w:r>
-      <w:r>
-        <w:t xml:space="preserve"> </w:t>
-      </w:r>
-      <w:r>
-        <w:t xml:space="preserve">progress”</w:t>
-      </w:r>
-      <w:r>
-        <w:t xml:space="preserve"> </w:t>
-      </w:r>
-      <w:r>
-        <w:t xml:space="preserve">is simpler; we wait instead so duplicates get the real result (bounded by 20 s, then 409).</w:t>
+        <w:t xml:space="preserve">a component and loses the transactional link to the booking database. Answering 409 at once while the</w:t>
+      </w:r>
+      <w:r>
+        <w:t xml:space="preserve"> </w:t>
+      </w:r>
+      <w:r>
+        <w:t xml:space="preserve">first request runs is simpler, but we wait so duplicates get the real result (up to 20 s, then 409).</w:t>
       </w:r>
     </w:p>
     <w:p>
@@ -5942,19 +5899,19 @@
         <w:t xml:space="preserve"> </w:t>
       </w:r>
       <w:r>
-        <w:t xml:space="preserve">A booking changes three databases. A distributed transaction (2PC) is not an option: it</w:t>
-      </w:r>
-      <w:r>
-        <w:t xml:space="preserve"> </w:t>
-      </w:r>
-      <w:r>
-        <w:t xml:space="preserve">needs every participant up at the same time, holds locks across services and is not available across</w:t>
-      </w:r>
-      <w:r>
-        <w:t xml:space="preserve"> </w:t>
-      </w:r>
-      <w:r>
-        <w:t xml:space="preserve">independent PostgreSQL instances behind REST (CS07). We need consistency without it.</w:t>
+        <w:t xml:space="preserve">A booking changes three databases. A distributed transaction (2PC) is not an option here.</w:t>
+      </w:r>
+      <w:r>
+        <w:t xml:space="preserve"> </w:t>
+      </w:r>
+      <w:r>
+        <w:t xml:space="preserve">It needs every participant up at the same time, holds locks across services, and is not available</w:t>
+      </w:r>
+      <w:r>
+        <w:t xml:space="preserve"> </w:t>
+      </w:r>
+      <w:r>
+        <w:t xml:space="preserve">between independent PostgreSQL instances behind REST APIs (CS07).</w:t>
       </w:r>
     </w:p>
     <w:p>
@@ -6227,7 +6184,7 @@
         <w:pStyle w:val="BodyText"/>
       </w:pPr>
       <w:r>
-        <w:t xml:space="preserve">Each state change is committed before the next remote call and each step and compensation is appended to</w:t>
+        <w:t xml:space="preserve">Each state change is committed before the next remote call, and every step and compensation goes into</w:t>
       </w:r>
       <w:r>
         <w:t xml:space="preserve"> </w:t>
@@ -6254,7 +6211,7 @@
         <w:t xml:space="preserve"> </w:t>
       </w:r>
       <w:r>
-        <w:t xml:space="preserve">(BR6) decides what to undo, newest first, counting anything that</w:t>
+        <w:t xml:space="preserve">(BR6) decides what to undo, newest first. It counts steps that</w:t>
       </w:r>
       <w:r>
         <w:t xml:space="preserve"> </w:t>
@@ -6276,7 +6233,7 @@
         <w:t xml:space="preserve"> </w:t>
       </w:r>
       <w:r>
-        <w:t xml:space="preserve">- after a timeout we refund</w:t>
+        <w:t xml:space="preserve">too: after a timeout we refund</w:t>
       </w:r>
       <w:r>
         <w:t xml:space="preserve"> </w:t>
@@ -6297,25 +6254,25 @@
         <w:t xml:space="preserve">“if held”</w:t>
       </w:r>
       <w:r>
-        <w:t xml:space="preserve">, both harmless when there is nothing to undo.</w:t>
-      </w:r>
-      <w:r>
-        <w:t xml:space="preserve"> </w:t>
-      </w:r>
-      <w:r>
-        <w:t xml:space="preserve">Compensations are idempotent (a payment refunds at most once, a hold releases at most once, a 404 means</w:t>
-      </w:r>
-      <w:r>
-        <w:t xml:space="preserve"> </w:t>
-      </w:r>
-      <w:r>
-        <w:t xml:space="preserve">nothing to undo) and are all attempted even if one fails, so a bank outage does not keep seats hostage.</w:t>
-      </w:r>
-      <w:r>
-        <w:t xml:space="preserve"> </w:t>
-      </w:r>
-      <w:r>
-        <w:t xml:space="preserve">Steps that still fail stay in</w:t>
+        <w:t xml:space="preserve">, which is harmless if nothing happened.</w:t>
+      </w:r>
+      <w:r>
+        <w:t xml:space="preserve"> </w:t>
+      </w:r>
+      <w:r>
+        <w:t xml:space="preserve">Compensations are idempotent (refund and release work at most once, a 404 means nothing to undo) and all</w:t>
+      </w:r>
+      <w:r>
+        <w:t xml:space="preserve"> </w:t>
+      </w:r>
+      <w:r>
+        <w:t xml:space="preserve">of them are tried even if one fails, so a bank outage does not keep the seats blocked. Failed steps stay</w:t>
+      </w:r>
+      <w:r>
+        <w:t xml:space="preserve"> </w:t>
+      </w:r>
+      <w:r>
+        <w:t xml:space="preserve">in</w:t>
       </w:r>
       <w:r>
         <w:t xml:space="preserve"> </w:t>
@@ -6327,13 +6284,13 @@
         <w:t xml:space="preserve">compensation_steps</w:t>
       </w:r>
       <w:r>
-        <w:t xml:space="preserve">; a recovery thread retries them, and also compensates</w:t>
-      </w:r>
-      <w:r>
-        <w:t xml:space="preserve"> </w:t>
-      </w:r>
-      <w:r>
-        <w:t xml:space="preserve">sagas abandoned by a crash (no progress for 60 s).</w:t>
+        <w:t xml:space="preserve">. A recovery thread retries them, and it also compensates sagas abandoned by a</w:t>
+      </w:r>
+      <w:r>
+        <w:t xml:space="preserve"> </w:t>
+      </w:r>
+      <w:r>
+        <w:t xml:space="preserve">crash (no progress for 60 s).</w:t>
       </w:r>
     </w:p>
     <w:p>
@@ -6366,13 +6323,13 @@
         <w:t xml:space="preserve">POST /api/v1/admin/faults {"operation": "confirm_hold", "times": 2}</w:t>
       </w:r>
       <w:r>
-        <w:t xml:space="preserve">); two failures because booking</w:t>
-      </w:r>
-      <w:r>
-        <w:t xml:space="preserve"> </w:t>
-      </w:r>
-      <w:r>
-        <w:t xml:space="preserve">retries an idempotent call once.</w:t>
+        <w:t xml:space="preserve">). It has to fail twice because</w:t>
+      </w:r>
+      <w:r>
+        <w:t xml:space="preserve"> </w:t>
+      </w:r>
+      <w:r>
+        <w:t xml:space="preserve">booking retries an idempotent call once.</w:t>
       </w:r>
     </w:p>
     <w:p>
@@ -6471,19 +6428,25 @@
         <w:t xml:space="preserve"> </w:t>
       </w:r>
       <w:r>
-        <w:t xml:space="preserve">Choreography would need a broker and spread the flow over four services; with one clear</w:t>
-      </w:r>
-      <w:r>
-        <w:t xml:space="preserve"> </w:t>
-      </w:r>
-      <w:r>
-        <w:t xml:space="preserve">owner of the booking lifecycle, orchestration is easier to follow and test (section 8). Forward recovery</w:t>
-      </w:r>
-      <w:r>
-        <w:t xml:space="preserve"> </w:t>
-      </w:r>
-      <w:r>
-        <w:t xml:space="preserve">(retry step 3 until it works) is friendlier, but a confirm can fail for good, so we compensate backwards.</w:t>
+        <w:t xml:space="preserve">Choreography would need a broker and would spread the flow over four services. Since</w:t>
+      </w:r>
+      <w:r>
+        <w:t xml:space="preserve"> </w:t>
+      </w:r>
+      <w:r>
+        <w:t xml:space="preserve">booking clearly owns the lifecycle, orchestration is easier to follow and test (section 8). Forward</w:t>
+      </w:r>
+      <w:r>
+        <w:t xml:space="preserve"> </w:t>
+      </w:r>
+      <w:r>
+        <w:t xml:space="preserve">recovery (retry step 3 until it works) is nicer for the passenger, but a confirm can fail for good, so we</w:t>
+      </w:r>
+      <w:r>
+        <w:t xml:space="preserve"> </w:t>
+      </w:r>
+      <w:r>
+        <w:t xml:space="preserve">compensate backwards.</w:t>
       </w:r>
       <w:r>
         <w:t xml:space="preserve"> </w:t>
@@ -6543,13 +6506,13 @@
         <w:t xml:space="preserve"> </w:t>
       </w:r>
       <w:r>
-        <w:t xml:space="preserve">and a capture that lands on a voided payment is refunded at once. Holds still HELD after 10 minutes are</w:t>
-      </w:r>
-      <w:r>
-        <w:t xml:space="preserve"> </w:t>
-      </w:r>
-      <w:r>
-        <w:t xml:space="preserve">released as a last safety net.</w:t>
+        <w:t xml:space="preserve">and a capture that lands on a voided payment is refunded at once. As a fallback, holds still HELD after</w:t>
+      </w:r>
+      <w:r>
+        <w:t xml:space="preserve"> </w:t>
+      </w:r>
+      <w:r>
+        <w:t xml:space="preserve">10 minutes are released by a sweep.</w:t>
       </w:r>
     </w:p>
     <w:p>
@@ -6567,25 +6530,19 @@
         <w:t xml:space="preserve"> </w:t>
       </w:r>
       <w:r>
-        <w:t xml:space="preserve">Seats of a booking that ends up compensated are held for its duration (usually well under</w:t>
-      </w:r>
-      <w:r>
-        <w:t xml:space="preserve"> </w:t>
-      </w:r>
-      <w:r>
-        <w:t xml:space="preserve">a second, a few seconds more when the bank is slow). A saga quiet for 60 s is assumed dead; timeouts keep</w:t>
-      </w:r>
-      <w:r>
-        <w:t xml:space="preserve"> </w:t>
-      </w:r>
-      <w:r>
-        <w:t xml:space="preserve">real sagas well below that. We trust the bank’s lookup by key to include requests still in flight, as</w:t>
-      </w:r>
-      <w:r>
-        <w:t xml:space="preserve"> </w:t>
-      </w:r>
-      <w:r>
-        <w:t xml:space="preserve">the mock bank does; with a real bank the settlement report would be the final check.</w:t>
+        <w:t xml:space="preserve">The seats of a booking that ends up compensated stay held while it runs (under a second,</w:t>
+      </w:r>
+      <w:r>
+        <w:t xml:space="preserve"> </w:t>
+      </w:r>
+      <w:r>
+        <w:t xml:space="preserve">a few seconds with a slow bank). A saga quiet for 60 s is treated as dead, far above our timeouts.</w:t>
+      </w:r>
+      <w:r>
+        <w:t xml:space="preserve"> </w:t>
+      </w:r>
+      <w:r>
+        <w:t xml:space="preserve">Reconciliation relies on the bank’s lookup by key including requests still in progress, as our mock does.</w:t>
       </w:r>
     </w:p>
     <w:bookmarkEnd w:id="62"/>
@@ -6603,25 +6560,25 @@
         <w:pStyle w:val="FirstParagraph"/>
       </w:pPr>
       <w:r>
-        <w:t xml:space="preserve">Although 3A was not our chosen challenge, payment-service needed basic resilience to make the saga</w:t>
-      </w:r>
-      <w:r>
-        <w:t xml:space="preserve"> </w:t>
-      </w:r>
-      <w:r>
-        <w:t xml:space="preserve">honest. Every bank call has a 2 s timeout and up to three attempts with exponential backoff and full</w:t>
-      </w:r>
-      <w:r>
-        <w:t xml:space="preserve"> </w:t>
-      </w:r>
-      <w:r>
-        <w:t xml:space="preserve">jitter (0-200 ms, then 0-400 ms), always with the same gateway key. A</w:t>
-      </w:r>
-      <w:r>
-        <w:t xml:space="preserve"> </w:t>
-      </w:r>
-      <w:r>
-        <w:t xml:space="preserve">connection refused, or 503 on every attempt, means nothing was taken (FAILED, 503). A request that was</w:t>
+        <w:t xml:space="preserve">We did not pick 3A, but the saga only works if payment-service copes with a bad bank, so it has basic</w:t>
+      </w:r>
+      <w:r>
+        <w:t xml:space="preserve"> </w:t>
+      </w:r>
+      <w:r>
+        <w:t xml:space="preserve">resilience. Every bank call has a 2 s timeout and up to three attempts with exponential backoff and full</w:t>
+      </w:r>
+      <w:r>
+        <w:t xml:space="preserve"> </w:t>
+      </w:r>
+      <w:r>
+        <w:t xml:space="preserve">jitter (0-200 ms, then 0-400 ms), always with the same gateway key. A refused connection, or 503 on every</w:t>
+      </w:r>
+      <w:r>
+        <w:t xml:space="preserve"> </w:t>
+      </w:r>
+      <w:r>
+        <w:t xml:space="preserve">attempt, means nothing was taken (FAILED, 503). A request that was</w:t>
       </w:r>
       <w:r>
         <w:t xml:space="preserve"> </w:t>
@@ -6696,7 +6653,7 @@
         <w:t xml:space="preserve"> </w:t>
       </w:r>
       <w:r>
-        <w:t xml:space="preserve">booking is CONFIRMED after 3.1 s with two attempts and exactly one capture.</w:t>
+        <w:t xml:space="preserve">booking is CONFIRMED after 3.1 s with two attempts and one capture.</w:t>
       </w:r>
     </w:p>
     <w:p>
@@ -7860,13 +7817,13 @@
         <w:t xml:space="preserve"> </w:t>
       </w:r>
       <w:r>
-        <w:t xml:space="preserve">A real Tatkal opening needs admission control - a virtual waiting room or rate</w:t>
-      </w:r>
-      <w:r>
-        <w:t xml:space="preserve"> </w:t>
-      </w:r>
-      <w:r>
-        <w:t xml:space="preserve">limiting in front of booking - and a way past the single hot quota row.</w:t>
+        <w:t xml:space="preserve">A real Tatkal opening needs admission control (a virtual waiting room or rate</w:t>
+      </w:r>
+      <w:r>
+        <w:t xml:space="preserve"> </w:t>
+      </w:r>
+      <w:r>
+        <w:t xml:space="preserve">limiting in front of booking) and a way around the single hot quota row.</w:t>
       </w:r>
     </w:p>
     <w:p>
@@ -7888,19 +7845,13 @@
         <w:t xml:space="preserve"> </w:t>
       </w:r>
       <w:r>
-        <w:t xml:space="preserve">There is no circuit breaker around the bank yet (the next step after timeouts and</w:t>
-      </w:r>
-      <w:r>
-        <w:t xml:space="preserve"> </w:t>
-      </w:r>
-      <w:r>
-        <w:t xml:space="preserve">retries), holds expire only through a coarse 10-minute sweep rather than a real reservation timer (3B),</w:t>
-      </w:r>
-      <w:r>
-        <w:t xml:space="preserve"> </w:t>
-      </w:r>
-      <w:r>
-        <w:t xml:space="preserve">and notifications could move to a broker (3D).</w:t>
+        <w:t xml:space="preserve">No circuit breaker around the bank yet, holds only expire through a coarse 10-minute</w:t>
+      </w:r>
+      <w:r>
+        <w:t xml:space="preserve"> </w:t>
+      </w:r>
+      <w:r>
+        <w:t xml:space="preserve">sweep (not a real 3B timer), and notifications could move to a broker (3D).</w:t>
       </w:r>
     </w:p>
     <w:p>
@@ -7922,13 +7873,13 @@
         <w:t xml:space="preserve"> </w:t>
       </w:r>
       <w:r>
-        <w:t xml:space="preserve">Tables are created at start-up; a real system needs migrations (Alembic). There are no</w:t>
-      </w:r>
-      <w:r>
-        <w:t xml:space="preserve"> </w:t>
-      </w:r>
-      <w:r>
-        <w:t xml:space="preserve">metrics or traces yet beyond correlated logs. Dev passwords live in</w:t>
+        <w:t xml:space="preserve">Tables are created at start-up, where a real system needs migrations (Alembic). There</w:t>
+      </w:r>
+      <w:r>
+        <w:t xml:space="preserve"> </w:t>
+      </w:r>
+      <w:r>
+        <w:t xml:space="preserve">are no metrics or traces beyond correlated logs, and dev passwords stay in</w:t>
       </w:r>
       <w:r>
         <w:t xml:space="preserve"> </w:t>
@@ -7943,13 +7894,7 @@
         <w:t xml:space="preserve"> </w:t>
       </w:r>
       <w:r>
-        <w:t xml:space="preserve">files and will move to</w:t>
-      </w:r>
-      <w:r>
-        <w:t xml:space="preserve"> </w:t>
-      </w:r>
-      <w:r>
-        <w:t xml:space="preserve">Kubernetes secrets in Assignment 2. Seat allocation, waiting list, RAC and charting are also missing.</w:t>
+        <w:t xml:space="preserve">files until Assignment 2.</w:t>
       </w:r>
     </w:p>
     <w:bookmarkEnd w:id="67"/>
@@ -7984,7 +7929,13 @@
         <w:br/>
       </w:r>
       <w:r>
-        <w:t xml:space="preserve">Google Drive (video, report, documents): [add link before submission] - Demo video: [add link]</w:t>
+        <w:t xml:space="preserve">Google Drive folder (demo video and documents): [Google Drive link]</w:t>
+      </w:r>
+      <w:r>
+        <w:br/>
+      </w:r>
+      <w:r>
+        <w:t xml:space="preserve">Demo video: [video link]</w:t>
       </w:r>
     </w:p>
     <w:p>
@@ -8095,7 +8046,7 @@
               <w:pStyle w:val="Compact"/>
             </w:pPr>
             <w:r>
-              <w:t xml:space="preserve">[BITS ID]</w:t>
+              <w:t xml:space="preserve">2025TM93139</w:t>
             </w:r>
           </w:p>
         </w:tc>
@@ -8161,7 +8112,7 @@
               <w:pStyle w:val="Compact"/>
             </w:pPr>
             <w:r>
-              <w:t xml:space="preserve">[BITS ID]</w:t>
+              <w:t xml:space="preserve">2025TM93530</w:t>
             </w:r>
           </w:p>
         </w:tc>
@@ -8218,7 +8169,7 @@
               <w:pStyle w:val="Compact"/>
             </w:pPr>
             <w:r>
-              <w:t xml:space="preserve">[BITS ID]</w:t>
+              <w:t xml:space="preserve">2025TM93221</w:t>
             </w:r>
           </w:p>
         </w:tc>
@@ -8275,7 +8226,7 @@
               <w:pStyle w:val="Compact"/>
             </w:pPr>
             <w:r>
-              <w:t xml:space="preserve">[BITS ID]</w:t>
+              <w:t xml:space="preserve">2023MT93400</w:t>
             </w:r>
           </w:p>
         </w:tc>
@@ -8339,13 +8290,31 @@
         <w:t xml:space="preserve"> </w:t>
       </w:r>
       <w:r>
-        <w:t xml:space="preserve">I built the booking saga, the idempotency store and the two background</w:t>
-      </w:r>
-      <w:r>
-        <w:t xml:space="preserve"> </w:t>
-      </w:r>
-      <w:r>
-        <w:t xml:space="preserve">jobs. The hardest problem was deciding what a failure</w:t>
+        <w:t xml:space="preserve">My part was the booking saga, the Idempotency-Key handling, the outbox</w:t>
+      </w:r>
+      <w:r>
+        <w:t xml:space="preserve"> </w:t>
+      </w:r>
+      <w:r>
+        <w:t xml:space="preserve">dispatcher and the recovery job, plus the scripts that start and test the whole system. The hardest thing</w:t>
+      </w:r>
+      <w:r>
+        <w:t xml:space="preserve"> </w:t>
+      </w:r>
+      <w:r>
+        <w:t xml:space="preserve">was working out what a failure actually tells the saga. A decline from the bank is a clear no and a</w:t>
+      </w:r>
+      <w:r>
+        <w:t xml:space="preserve"> </w:t>
+      </w:r>
+      <w:r>
+        <w:t xml:space="preserve">refused connection means nothing happened, but a timeout after the request went out could mean either.</w:t>
+      </w:r>
+      <w:r>
+        <w:t xml:space="preserve"> </w:t>
+      </w:r>
+      <w:r>
+        <w:t xml:space="preserve">So the compensation plan has to cover steps that</w:t>
       </w:r>
       <w:r>
         <w:t xml:space="preserve"> </w:t>
@@ -8355,115 +8324,49 @@
           <w:i/>
           <w:iCs/>
         </w:rPr>
-        <w:t xml:space="preserve">means</w:t>
-      </w:r>
-      <w:r>
-        <w:t xml:space="preserve"> </w:t>
-      </w:r>
-      <w:r>
-        <w:t xml:space="preserve">to the saga. A decline from the bank is a</w:t>
-      </w:r>
-      <w:r>
-        <w:t xml:space="preserve"> </w:t>
-      </w:r>
-      <w:r>
-        <w:t xml:space="preserve">clear</w:t>
-      </w:r>
-      <w:r>
-        <w:t xml:space="preserve"> </w:t>
-      </w:r>
-      <w:r>
-        <w:t xml:space="preserve">“no”</w:t>
-      </w:r>
-      <w:r>
-        <w:t xml:space="preserve">, a refused connection means nothing happened, but a timeout after the request was sent means</w:t>
-      </w:r>
-      <w:r>
-        <w:t xml:space="preserve"> </w:t>
-      </w:r>
-      <w:r>
-        <w:t xml:space="preserve">the money may or may not have been taken - so the compensation plan works with</w:t>
-      </w:r>
-      <w:r>
-        <w:t xml:space="preserve"> </w:t>
-      </w:r>
-      <w:r>
-        <w:t xml:space="preserve">“may have happened”</w:t>
-      </w:r>
-      <w:r>
-        <w:t xml:space="preserve"> </w:t>
-      </w:r>
-      <w:r>
-        <w:t xml:space="preserve">and</w:t>
-      </w:r>
-      <w:r>
-        <w:t xml:space="preserve"> </w:t>
-      </w:r>
-      <w:r>
-        <w:t xml:space="preserve">every compensation has to be safe when there is nothing to undo. Two things surprised me while testing.</w:t>
-      </w:r>
-      <w:r>
-        <w:t xml:space="preserve"> </w:t>
-      </w:r>
-      <w:r>
-        <w:t xml:space="preserve">Our first forced failure at step 3 did not fail at all, because my client correctly retried the</w:t>
-      </w:r>
-      <w:r>
-        <w:t xml:space="preserve"> </w:t>
-      </w:r>
-      <w:r>
-        <w:t xml:space="preserve">idempotent confirm call once and the retry succeeded - the fault had to cover both attempts. And a</w:t>
-      </w:r>
-      <w:r>
-        <w:t xml:space="preserve"> </w:t>
-      </w:r>
-      <w:r>
-        <w:t xml:space="preserve">booking left over from a crashed test run was retried by the recovery job every 20 seconds because</w:t>
-      </w:r>
-      <w:r>
-        <w:t xml:space="preserve"> </w:t>
-      </w:r>
-      <w:r>
-        <w:t xml:space="preserve">inventory answered 404 for its hold; a 404 has to count as</w:t>
-      </w:r>
-      <w:r>
-        <w:t xml:space="preserve"> </w:t>
-      </w:r>
-      <w:r>
-        <w:t xml:space="preserve">“nothing to undo”</w:t>
-      </w:r>
-      <w:r>
-        <w:t xml:space="preserve">, and the tests should never</w:t>
-      </w:r>
-      <w:r>
-        <w:t xml:space="preserve"> </w:t>
-      </w:r>
-      <w:r>
-        <w:t xml:space="preserve">have shared tables with the running service. If I started again I would make the saga steps a small</w:t>
-      </w:r>
-      <w:r>
-        <w:t xml:space="preserve"> </w:t>
-      </w:r>
-      <w:r>
-        <w:t xml:space="preserve">table-driven engine instead of one long method, and replace the polling wait for duplicate idempotency</w:t>
-      </w:r>
-      <w:r>
-        <w:t xml:space="preserve"> </w:t>
-      </w:r>
-      <w:r>
-        <w:t xml:space="preserve">keys with PostgreSQL</w:t>
-      </w:r>
-      <w:r>
-        <w:t xml:space="preserve"> </w:t>
-      </w:r>
-      <w:r>
-        <w:rPr>
-          <w:rStyle w:val="VerbatimChar"/>
-        </w:rPr>
-        <w:t xml:space="preserve">LISTEN/NOTIFY</w:t>
-      </w:r>
-      <w:r>
-        <w:t xml:space="preserve">.</w:t>
+        <w:t xml:space="preserve">may</w:t>
+      </w:r>
+      <w:r>
+        <w:t xml:space="preserve"> </w:t>
+      </w:r>
+      <w:r>
+        <w:t xml:space="preserve">have happened, and every compensation has to be</w:t>
+      </w:r>
+      <w:r>
+        <w:t xml:space="preserve"> </w:t>
+      </w:r>
+      <w:r>
+        <w:t xml:space="preserve">safe when there is nothing to undo. Testing caught me out twice. My first forced failure at step 3 never</w:t>
+      </w:r>
+      <w:r>
+        <w:t xml:space="preserve"> </w:t>
+      </w:r>
+      <w:r>
+        <w:t xml:space="preserve">failed, because the client retried the confirm call and the retry worked, so the fault had to cover both</w:t>
+      </w:r>
+      <w:r>
+        <w:t xml:space="preserve"> </w:t>
+      </w:r>
+      <w:r>
+        <w:t xml:space="preserve">attempts. Later the recovery job kept retrying an old booking from a crashed test run every 20 seconds,</w:t>
+      </w:r>
+      <w:r>
+        <w:t xml:space="preserve"> </w:t>
+      </w:r>
+      <w:r>
+        <w:t xml:space="preserve">because inventory answered 404 for its hold. A 404 now counts as nothing to undo, and the integration</w:t>
+      </w:r>
+      <w:r>
+        <w:t xml:space="preserve"> </w:t>
+      </w:r>
+      <w:r>
+        <w:t xml:space="preserve">tests run in their own schema. If I did it again I would turn the saga into a small table of steps</w:t>
+      </w:r>
+      <w:r>
+        <w:t xml:space="preserve"> </w:t>
+      </w:r>
+      <w:r>
+        <w:t xml:space="preserve">instead of one long method, and use PostgreSQL LISTEN/NOTIFY instead of polling for duplicate keys.</w:t>
       </w:r>
     </w:p>
     <w:p>
@@ -8481,67 +8384,61 @@
         <w:t xml:space="preserve"> </w:t>
       </w:r>
       <w:r>
-        <w:t xml:space="preserve">I owned the seat quota, the fare rule and the</w:t>
-      </w:r>
-      <w:r>
-        <w:t xml:space="preserve"> </w:t>
-      </w:r>
-      <w:r>
-        <w:t xml:space="preserve">hold API. The hardest part was proving the concurrency control rather than just writing it. A</w:t>
-      </w:r>
-      <w:r>
-        <w:t xml:space="preserve"> </w:t>
-      </w:r>
-      <w:r>
-        <w:t xml:space="preserve">check-then-update looked correct in every single-request test, so we kept a naive version behind a dev</w:t>
-      </w:r>
-      <w:r>
-        <w:t xml:space="preserve"> </w:t>
-      </w:r>
-      <w:r>
-        <w:t xml:space="preserve">switch and raced 20 bookings against it: it sold all 20 seats of a 5-seat quota and left the counter at</w:t>
-      </w:r>
-      <w:r>
-        <w:t xml:space="preserve"> </w:t>
-      </w:r>
-      <w:r>
-        <w:t xml:space="preserve">4. Seeing that number made it obvious why the check and the decrement must be one statement, and why the</w:t>
-      </w:r>
-      <w:r>
-        <w:t xml:space="preserve"> </w:t>
-      </w:r>
-      <w:r>
-        <w:t xml:space="preserve">CHECK constraint alone could never catch a lost update. I also learned that</w:t>
-      </w:r>
-      <w:r>
-        <w:t xml:space="preserve"> </w:t>
-      </w:r>
-      <w:r>
-        <w:t xml:space="preserve">“idempotent per booking_id”</w:t>
-      </w:r>
-      <w:r>
-        <w:t xml:space="preserve"> </w:t>
-      </w:r>
-      <w:r>
-        <w:t xml:space="preserve">needs more than a unique constraint: a review found that a retry overlapping the first hold request got</w:t>
-      </w:r>
-      <w:r>
-        <w:t xml:space="preserve"> </w:t>
-      </w:r>
-      <w:r>
-        <w:t xml:space="preserve">409 and left that hold’s seats owned by nobody. Inserting the hold row before taking the seats fixed it,</w:t>
-      </w:r>
-      <w:r>
-        <w:t xml:space="preserve"> </w:t>
-      </w:r>
-      <w:r>
-        <w:t xml:space="preserve">and we added a 10-minute expiry for holds as a safety net. With more time I would split the hot quota row</w:t>
-      </w:r>
-      <w:r>
-        <w:t xml:space="preserve"> </w:t>
-      </w:r>
-      <w:r>
-        <w:t xml:space="preserve">into buckets.</w:t>
+        <w:t xml:space="preserve">I worked on inventory-service: trains and fares, the</w:t>
+      </w:r>
+      <w:r>
+        <w:t xml:space="preserve"> </w:t>
+      </w:r>
+      <w:r>
+        <w:t xml:space="preserve">Tatkal quota, and the hold, confirm and release API. Writing the atomic update was quick. Showing that it</w:t>
+      </w:r>
+      <w:r>
+        <w:t xml:space="preserve"> </w:t>
+      </w:r>
+      <w:r>
+        <w:t xml:space="preserve">works was harder, because a check-then-update version also passes every test that sends one request at a</w:t>
+      </w:r>
+      <w:r>
+        <w:t xml:space="preserve"> </w:t>
+      </w:r>
+      <w:r>
+        <w:t xml:space="preserve">time. So we kept a naive version behind a dev switch and sent 20 bookings at a 5-seat quota. It confirmed</w:t>
+      </w:r>
+      <w:r>
+        <w:t xml:space="preserve"> </w:t>
+      </w:r>
+      <w:r>
+        <w:t xml:space="preserve">all 20 and left the counter at 4. After seeing that, it was clear to me why the check and the decrement</w:t>
+      </w:r>
+      <w:r>
+        <w:t xml:space="preserve"> </w:t>
+      </w:r>
+      <w:r>
+        <w:t xml:space="preserve">have to be one statement, and why the CHECK constraint cannot catch a lost update. The second lesson was</w:t>
+      </w:r>
+      <w:r>
+        <w:t xml:space="preserve"> </w:t>
+      </w:r>
+      <w:r>
+        <w:t xml:space="preserve">about retries. During review we found that a retried hold that overlapped the first one got 409, and the</w:t>
+      </w:r>
+      <w:r>
+        <w:t xml:space="preserve"> </w:t>
+      </w:r>
+      <w:r>
+        <w:t xml:space="preserve">first hold’s seats were left with no owner. Inserting the hold row first and only then taking the seats</w:t>
+      </w:r>
+      <w:r>
+        <w:t xml:space="preserve"> </w:t>
+      </w:r>
+      <w:r>
+        <w:t xml:space="preserve">fixed it. We also added a 10-minute expiry for holds in case one is ever left behind. With more time I</w:t>
+      </w:r>
+      <w:r>
+        <w:t xml:space="preserve"> </w:t>
+      </w:r>
+      <w:r>
+        <w:t xml:space="preserve">would split the hot quota row into buckets, so that one popular train does not queue on a single row.</w:t>
       </w:r>
     </w:p>
     <w:p>
@@ -8559,94 +8456,67 @@
         <w:t xml:space="preserve"> </w:t>
       </w:r>
       <w:r>
-        <w:t xml:space="preserve">I built the payment service, its client for</w:t>
-      </w:r>
-      <w:r>
-        <w:t xml:space="preserve"> </w:t>
-      </w:r>
-      <w:r>
-        <w:t xml:space="preserve">the bank and the mock bank itself. The hardest problem was the difference between</w:t>
-      </w:r>
-      <w:r>
-        <w:t xml:space="preserve"> </w:t>
-      </w:r>
-      <w:r>
-        <w:t xml:space="preserve">“the bank said no”</w:t>
-      </w:r>
-      <w:r>
-        <w:t xml:space="preserve"> </w:t>
-      </w:r>
-      <w:r>
-        <w:t xml:space="preserve">and</w:t>
-      </w:r>
-      <w:r>
-        <w:t xml:space="preserve"> </w:t>
-      </w:r>
-      <w:r>
-        <w:t xml:space="preserve">“the bank did not answer”</w:t>
-      </w:r>
-      <w:r>
-        <w:t xml:space="preserve">. A declined payment is final, a refused connection means nothing happened, but</w:t>
-      </w:r>
-      <w:r>
-        <w:t xml:space="preserve"> </w:t>
-      </w:r>
-      <w:r>
-        <w:t xml:space="preserve">a timeout after the request was sent is unknown. I handled it by keeping such payments PENDING,</w:t>
-      </w:r>
-      <w:r>
-        <w:t xml:space="preserve"> </w:t>
-      </w:r>
-      <w:r>
-        <w:t xml:space="preserve">retrying only with the same idempotency key, and reconciling with the bank before any refund. Making the</w:t>
-      </w:r>
-      <w:r>
-        <w:t xml:space="preserve"> </w:t>
-      </w:r>
-      <w:r>
-        <w:t xml:space="preserve">mock bank deduplicate requests while the first one is still being processed is what lets the slow-bank</w:t>
-      </w:r>
-      <w:r>
-        <w:t xml:space="preserve"> </w:t>
-      </w:r>
-      <w:r>
-        <w:t xml:space="preserve">run end with exactly one capture over two attempts. A review also found a gap I had missed: a refund</w:t>
-      </w:r>
-      <w:r>
-        <w:t xml:space="preserve"> </w:t>
-      </w:r>
-      <w:r>
-        <w:t xml:space="preserve">arriving while my charge was still retrying voided the payment, and a capture that came back afterwards</w:t>
-      </w:r>
-      <w:r>
-        <w:t xml:space="preserve"> </w:t>
-      </w:r>
-      <w:r>
-        <w:t xml:space="preserve">was kept. Closing it took a</w:t>
-      </w:r>
-      <w:r>
-        <w:t xml:space="preserve"> </w:t>
-      </w:r>
-      <w:r>
-        <w:t xml:space="preserve">“still wanted?”</w:t>
-      </w:r>
-      <w:r>
-        <w:t xml:space="preserve"> </w:t>
-      </w:r>
-      <w:r>
-        <w:t xml:space="preserve">check before every attempt, a 503 while a charge may still be</w:t>
-      </w:r>
-      <w:r>
-        <w:t xml:space="preserve"> </w:t>
-      </w:r>
-      <w:r>
-        <w:t xml:space="preserve">running, and an immediate refund for a capture that lands on a voided payment. Next I would add a circuit</w:t>
-      </w:r>
-      <w:r>
-        <w:t xml:space="preserve"> </w:t>
-      </w:r>
-      <w:r>
-        <w:t xml:space="preserve">breaker so a dead bank fails fast instead of costing three attempts per request.</w:t>
+        <w:t xml:space="preserve">I wrote payment-service, its client for the bank,</w:t>
+      </w:r>
+      <w:r>
+        <w:t xml:space="preserve"> </w:t>
+      </w:r>
+      <w:r>
+        <w:t xml:space="preserve">and the mock bank we test against. Most of my time went into one question: what do we do when the bank</w:t>
+      </w:r>
+      <w:r>
+        <w:t xml:space="preserve"> </w:t>
+      </w:r>
+      <w:r>
+        <w:t xml:space="preserve">does not answer? A decline is final and a refused connection means no money moved, but after a timeout we</w:t>
+      </w:r>
+      <w:r>
+        <w:t xml:space="preserve"> </w:t>
+      </w:r>
+      <w:r>
+        <w:t xml:space="preserve">just do not know. We keep those payments PENDING, retry only with the same gateway key, and check with the</w:t>
+      </w:r>
+      <w:r>
+        <w:t xml:space="preserve"> </w:t>
+      </w:r>
+      <w:r>
+        <w:t xml:space="preserve">bank before refunding anything. The mock bank also had to behave like a real one and hold back a</w:t>
+      </w:r>
+      <w:r>
+        <w:t xml:space="preserve"> </w:t>
+      </w:r>
+      <w:r>
+        <w:t xml:space="preserve">duplicate request until the first one finished, which is why the slow-bank run ends with one capture over</w:t>
+      </w:r>
+      <w:r>
+        <w:t xml:space="preserve"> </w:t>
+      </w:r>
+      <w:r>
+        <w:t xml:space="preserve">two attempts. The review found a case I had missed. If a refund came in while my charge was still between</w:t>
+      </w:r>
+      <w:r>
+        <w:t xml:space="preserve"> </w:t>
+      </w:r>
+      <w:r>
+        <w:t xml:space="preserve">retries, the payment was voided, and a capture coming back after that was kept. Now the charge checks</w:t>
+      </w:r>
+      <w:r>
+        <w:t xml:space="preserve"> </w:t>
+      </w:r>
+      <w:r>
+        <w:t xml:space="preserve">before each attempt whether it is still wanted, the refund gets a 503 while a charge may still be running,</w:t>
+      </w:r>
+      <w:r>
+        <w:t xml:space="preserve"> </w:t>
+      </w:r>
+      <w:r>
+        <w:t xml:space="preserve">and a late capture is refunded straight away. Next I would add a circuit breaker, so a dead bank fails</w:t>
+      </w:r>
+      <w:r>
+        <w:t xml:space="preserve"> </w:t>
+      </w:r>
+      <w:r>
+        <w:t xml:space="preserve">fast instead of costing three attempts per request.</w:t>
       </w:r>
     </w:p>
     <w:p>
@@ -8664,61 +8534,31 @@
         <w:t xml:space="preserve"> </w:t>
       </w:r>
       <w:r>
-        <w:t xml:space="preserve">I owned notifications and the</w:t>
-      </w:r>
-      <w:r>
-        <w:t xml:space="preserve"> </w:t>
-      </w:r>
-      <w:r>
-        <w:t xml:space="preserve">end-to-end and saga test scripts. The interesting part of notifications was that the outbox delivers</w:t>
-      </w:r>
-      <w:r>
-        <w:t xml:space="preserve"> </w:t>
-      </w:r>
-      <w:r>
-        <w:rPr>
-          <w:i/>
-          <w:iCs/>
-        </w:rPr>
-        <w:t xml:space="preserve">at</w:t>
-      </w:r>
-      <w:r>
-        <w:rPr>
-          <w:i/>
-          <w:iCs/>
-        </w:rPr>
-        <w:t xml:space="preserve"> </w:t>
-      </w:r>
-      <w:r>
-        <w:rPr>
-          <w:i/>
-          <w:iCs/>
-        </w:rPr>
-        <w:t xml:space="preserve">least</w:t>
-      </w:r>
-      <w:r>
-        <w:t xml:space="preserve"> </w:t>
-      </w:r>
-      <w:r>
-        <w:t xml:space="preserve">once, so my service had to be an idempotent consumer: it claims each channel of an event with a</w:t>
-      </w:r>
-      <w:r>
-        <w:t xml:space="preserve"> </w:t>
-      </w:r>
-      <w:r>
-        <w:t xml:space="preserve">unique row, marks it SENT as soon as it goes out, and on a provider failure gives back only what was not</w:t>
-      </w:r>
-      <w:r>
-        <w:t xml:space="preserve"> </w:t>
-      </w:r>
-      <w:r>
-        <w:t xml:space="preserve">sent. My first version released the whole event when only the e-mail failed, so the retry sent the SMS</w:t>
-      </w:r>
-      <w:r>
-        <w:t xml:space="preserve"> </w:t>
-      </w:r>
-      <w:r>
-        <w:t xml:space="preserve">twice, and it answered</w:t>
+        <w:t xml:space="preserve">I did notification-service, the</w:t>
+      </w:r>
+      <w:r>
+        <w:t xml:space="preserve"> </w:t>
+      </w:r>
+      <w:r>
+        <w:t xml:space="preserve">end-to-end tests and the saga scenarios in the Challenge 3 script. The outbox can send the same event more</w:t>
+      </w:r>
+      <w:r>
+        <w:t xml:space="preserve"> </w:t>
+      </w:r>
+      <w:r>
+        <w:t xml:space="preserve">than once, so notification-service has to ignore repeats. Each channel of an event gets its own row with</w:t>
+      </w:r>
+      <w:r>
+        <w:t xml:space="preserve"> </w:t>
+      </w:r>
+      <w:r>
+        <w:t xml:space="preserve">a unique key and is marked SENT as soon as the provider accepts it. My first version had two bugs. When</w:t>
+      </w:r>
+      <w:r>
+        <w:t xml:space="preserve"> </w:t>
+      </w:r>
+      <w:r>
+        <w:t xml:space="preserve">only the e-mail failed it released the whole event, so the retry sent the SMS again, and it answered</w:t>
       </w:r>
       <w:r>
         <w:t xml:space="preserve"> </w:t>
@@ -8730,43 +8570,43 @@
         <w:t xml:space="preserve"> </w:t>
       </w:r>
       <w:r>
-        <w:t xml:space="preserve">while another delivery was still sending. The hardest problem on the</w:t>
-      </w:r>
-      <w:r>
-        <w:t xml:space="preserve"> </w:t>
-      </w:r>
-      <w:r>
-        <w:t xml:space="preserve">testing side was making failure scenarios deterministic. Our first attempt at</w:t>
-      </w:r>
-      <w:r>
-        <w:t xml:space="preserve"> </w:t>
-      </w:r>
-      <w:r>
-        <w:t xml:space="preserve">“the refund fails”</w:t>
-      </w:r>
-      <w:r>
-        <w:t xml:space="preserve"> </w:t>
-      </w:r>
-      <w:r>
-        <w:t xml:space="preserve">depended</w:t>
-      </w:r>
-      <w:r>
-        <w:t xml:space="preserve"> </w:t>
-      </w:r>
-      <w:r>
-        <w:t xml:space="preserve">on timing; adding a partial-outage mode to the mock bank (refunds down, charges up) made it repeatable.</w:t>
-      </w:r>
-      <w:r>
-        <w:t xml:space="preserve"> </w:t>
-      </w:r>
-      <w:r>
-        <w:t xml:space="preserve">Next time I would add a dead-letter view for events that can never be delivered, and run the e2e suite in</w:t>
-      </w:r>
-      <w:r>
-        <w:t xml:space="preserve"> </w:t>
-      </w:r>
-      <w:r>
-        <w:t xml:space="preserve">CI on every push.</w:t>
+        <w:t xml:space="preserve">while another delivery was still sending. Now only the unsent channels are released, and a</w:t>
+      </w:r>
+      <w:r>
+        <w:t xml:space="preserve"> </w:t>
+      </w:r>
+      <w:r>
+        <w:t xml:space="preserve">repeat either waits for the first delivery or asks the outbox to try again later. On the testing side the</w:t>
+      </w:r>
+      <w:r>
+        <w:t xml:space="preserve"> </w:t>
+      </w:r>
+      <w:r>
+        <w:t xml:space="preserve">hard part was making failures repeatable. Our first</w:t>
+      </w:r>
+      <w:r>
+        <w:t xml:space="preserve"> </w:t>
+      </w:r>
+      <w:r>
+        <w:t xml:space="preserve">“refund fails”</w:t>
+      </w:r>
+      <w:r>
+        <w:t xml:space="preserve"> </w:t>
+      </w:r>
+      <w:r>
+        <w:t xml:space="preserve">scenario depended on timing and only</w:t>
+      </w:r>
+      <w:r>
+        <w:t xml:space="preserve"> </w:t>
+      </w:r>
+      <w:r>
+        <w:t xml:space="preserve">became reliable after we added a refunds-only outage mode to the mock bank. With more time I would add a</w:t>
+      </w:r>
+      <w:r>
+        <w:t xml:space="preserve"> </w:t>
+      </w:r>
+      <w:r>
+        <w:t xml:space="preserve">dead-letter view for events that can never be delivered, and run the e2e tests in CI on every push.</w:t>
       </w:r>
     </w:p>
     <w:bookmarkEnd w:id="70"/>
@@ -8800,13 +8640,7 @@
         <w:t xml:space="preserve"> </w:t>
       </w:r>
       <w:r>
-        <w:t xml:space="preserve">in VS Code, in agent mode, for this assignment. As the course policy asks,</w:t>
-      </w:r>
-      <w:r>
-        <w:t xml:space="preserve"> </w:t>
-      </w:r>
-      <w:r>
-        <w:t xml:space="preserve">here is what it was used for:</w:t>
+        <w:t xml:space="preserve">in VS Code (agent mode) throughout this assignment:</w:t>
       </w:r>
     </w:p>
     <w:p>
@@ -8828,13 +8662,13 @@
         <w:t xml:space="preserve"> </w:t>
       </w:r>
       <w:r>
-        <w:t xml:space="preserve">It proposed the Tatkal domain, the four-service decomposition, business rules BR1-BR7 and</w:t>
-      </w:r>
-      <w:r>
-        <w:t xml:space="preserve"> </w:t>
-      </w:r>
-      <w:r>
-        <w:t xml:space="preserve">the choice of Challenge 3C, working from the assignment brief and our lecture slides and lab sheets.</w:t>
+        <w:t xml:space="preserve">It suggested the Tatkal domain, the split into four services, business rules BR1-BR7 and</w:t>
+      </w:r>
+      <w:r>
+        <w:t xml:space="preserve"> </w:t>
+      </w:r>
+      <w:r>
+        <w:t xml:space="preserve">Challenge 3C, working from the assignment brief and our lecture slides and lab sheets.</w:t>
       </w:r>
     </w:p>
     <w:p>
@@ -8850,19 +8684,19 @@
           <w:b/>
           <w:bCs/>
         </w:rPr>
-        <w:t xml:space="preserve">Code.</w:t>
-      </w:r>
-      <w:r>
-        <w:t xml:space="preserve"> </w:t>
-      </w:r>
-      <w:r>
-        <w:t xml:space="preserve">It wrote the code of the five services, the unit, integration and end-to-end tests, the run</w:t>
-      </w:r>
-      <w:r>
-        <w:t xml:space="preserve"> </w:t>
-      </w:r>
-      <w:r>
-        <w:t xml:space="preserve">and challenge scripts, and the Mermaid sources of the diagrams.</w:t>
+        <w:t xml:space="preserve">Code and tests.</w:t>
+      </w:r>
+      <w:r>
+        <w:t xml:space="preserve"> </w:t>
+      </w:r>
+      <w:r>
+        <w:t xml:space="preserve">It wrote most of the code of the five services, the unit, integration and</w:t>
+      </w:r>
+      <w:r>
+        <w:t xml:space="preserve"> </w:t>
+      </w:r>
+      <w:r>
+        <w:t xml:space="preserve">end-to-end tests, the scripts and the Mermaid diagrams.</w:t>
       </w:r>
     </w:p>
     <w:p>
@@ -8878,13 +8712,13 @@
           <w:b/>
           <w:bCs/>
         </w:rPr>
-        <w:t xml:space="preserve">Running, evidence and review.</w:t>
-      </w:r>
-      <w:r>
-        <w:t xml:space="preserve"> </w:t>
-      </w:r>
-      <w:r>
-        <w:t xml:space="preserve">It ran the test suites and the scripts that produced the files in</w:t>
+        <w:t xml:space="preserve">Running and review.</w:t>
+      </w:r>
+      <w:r>
+        <w:t xml:space="preserve"> </w:t>
+      </w:r>
+      <w:r>
+        <w:t xml:space="preserve">It ran the tests and the scripts that produced the files in</w:t>
       </w:r>
       <w:r>
         <w:t xml:space="preserve"> </w:t>
@@ -8899,13 +8733,19 @@
         <w:t xml:space="preserve"> </w:t>
       </w:r>
       <w:r>
-        <w:t xml:space="preserve">(the outputs are unedited). A separate Copilot review agent then reviewed the code; the six</w:t>
-      </w:r>
-      <w:r>
-        <w:t xml:space="preserve"> </w:t>
-      </w:r>
-      <w:r>
-        <w:t xml:space="preserve">problems it found (mostly retries, compensations and late results racing each other) were fixed and retested.</w:t>
+        <w:t xml:space="preserve">(the</w:t>
+      </w:r>
+      <w:r>
+        <w:t xml:space="preserve"> </w:t>
+      </w:r>
+      <w:r>
+        <w:t xml:space="preserve">outputs are not edited). A Copilot review agent then reviewed the code and found six bugs, mostly</w:t>
+      </w:r>
+      <w:r>
+        <w:t xml:space="preserve"> </w:t>
+      </w:r>
+      <w:r>
+        <w:t xml:space="preserve">retries, compensations and late results racing each other. They were fixed and retested.</w:t>
       </w:r>
     </w:p>
     <w:p>
@@ -8927,13 +8767,13 @@
         <w:t xml:space="preserve"> </w:t>
       </w:r>
       <w:r>
-        <w:t xml:space="preserve">It drafted the README files, this report (including first drafts of the reflections in</w:t>
-      </w:r>
-      <w:r>
-        <w:t xml:space="preserve"> </w:t>
-      </w:r>
-      <w:r>
-        <w:t xml:space="preserve">Appendix B) and the video script.</w:t>
+        <w:t xml:space="preserve">It drafted the READMEs, this report, first drafts of our reflections and a plan for the</w:t>
+      </w:r>
+      <w:r>
+        <w:t xml:space="preserve"> </w:t>
+      </w:r>
+      <w:r>
+        <w:t xml:space="preserve">demo video.</w:t>
       </w:r>
     </w:p>
     <w:p>
@@ -8941,13 +8781,25 @@
         <w:pStyle w:val="FirstParagraph"/>
       </w:pPr>
       <w:r>
-        <w:t xml:space="preserve">[To be completed by the team before submission: what each member reviewed, changed or rewrote, and how</w:t>
-      </w:r>
-      <w:r>
-        <w:t xml:space="preserve"> </w:t>
-      </w:r>
-      <w:r>
-        <w:t xml:space="preserve">the team checked the work.]</w:t>
+        <w:t xml:space="preserve">Our own part: we agreed on the domain and reviewed the design, and each of us went through the service</w:t>
+      </w:r>
+      <w:r>
+        <w:t xml:space="preserve"> </w:t>
+      </w:r>
+      <w:r>
+        <w:t xml:space="preserve">we own until we could explain it, including everything we show in the video. Every member ran the</w:t>
+      </w:r>
+      <w:r>
+        <w:t xml:space="preserve"> </w:t>
+      </w:r>
+      <w:r>
+        <w:t xml:space="preserve">system, the tests and the challenge scripts on their own laptop, and we checked the evidence files</w:t>
+      </w:r>
+      <w:r>
+        <w:t xml:space="preserve"> </w:t>
+      </w:r>
+      <w:r>
+        <w:t xml:space="preserve">against the claims in this report before submitting.</w:t>
       </w:r>
     </w:p>
     <w:bookmarkEnd w:id="71"/>

</xml_diff>

<commit_message>
report: numbers from the new evidence run
</commit_message>
<xml_diff>
--- a/docs/report/Tatkal_Booking_System_Design_Report.docx
+++ b/docs/report/Tatkal_Booking_System_Design_Report.docx
@@ -1723,7 +1723,7 @@
       <w:r>
         <w:drawing>
           <wp:inline>
-            <wp:extent cx="6261100" cy="2395829"/>
+            <wp:extent cx="6261100" cy="2403815"/>
             <wp:effectExtent b="0" l="0" r="0" t="0"/>
             <wp:docPr descr="Component diagram. Solid arrows are synchronous HTTP/JSON calls made while the passenger waits; dotted arrows are asynchronous or optional. Every service uses only its own database." title="" id="20" name="Picture"/>
             <a:graphic>
@@ -1744,7 +1744,7 @@
                   <pic:spPr bwMode="auto">
                     <a:xfrm>
                       <a:off x="0" y="0"/>
-                      <a:ext cx="6261100" cy="2395829"/>
+                      <a:ext cx="6261100" cy="2403815"/>
                     </a:xfrm>
                     <a:prstGeom prst="rect">
                       <a:avLst/>
@@ -6404,7 +6404,7 @@
         <w:t xml:space="preserve"> </w:t>
       </w:r>
       <w:r>
-        <w:t xml:space="preserve">when the bank recovers, the recovery job completes the refund with no API call, 21 s later. A final check</w:t>
+        <w:t xml:space="preserve">when the bank recovers, the recovery job completes the refund with no API call, 24 s later. A final check</w:t>
       </w:r>
       <w:r>
         <w:t xml:space="preserve"> </w:t>
@@ -6675,7 +6675,7 @@
         <w:t xml:space="preserve"> </w:t>
       </w:r>
       <w:r>
-        <w:t xml:space="preserve">The booking fails in 0.4 s with 503, the payment is FAILED and the seats are released.</w:t>
+        <w:t xml:space="preserve">The booking fails in 0.5 s with 503, the payment is FAILED and the seats are released.</w:t>
       </w:r>
     </w:p>
     <w:p>
@@ -6697,13 +6697,22 @@
         <w:t xml:space="preserve"> </w:t>
       </w:r>
       <w:r>
-        <w:t xml:space="preserve">Three of four bookings succeeded (one on a retry) and one failed</w:t>
-      </w:r>
-      <w:r>
-        <w:t xml:space="preserve"> </w:t>
-      </w:r>
-      <w:r>
-        <w:t xml:space="preserve">cleanly after three attempts with its seats released; none was captured twice.</w:t>
+        <w:t xml:space="preserve">All four bookings went through, two of them on the second attempt,</w:t>
+      </w:r>
+      <w:r>
+        <w:t xml:space="preserve"> </w:t>
+      </w:r>
+      <w:r>
+        <w:t xml:space="preserve">and none was captured twice. (A booking that runs out of attempts fails like</w:t>
+      </w:r>
+      <w:r>
+        <w:t xml:space="preserve"> </w:t>
+      </w:r>
+      <w:r>
+        <w:t xml:space="preserve">“bank down”</w:t>
+      </w:r>
+      <w:r>
+        <w:t xml:space="preserve">.)</w:t>
       </w:r>
     </w:p>
     <w:bookmarkEnd w:id="63"/>

</xml_diff>